<commit_message>
Update footer to CV
</commit_message>
<xml_diff>
--- a/derieux-cv.docx
+++ b/derieux-cv.docx
@@ -1215,11 +1215,16 @@
                     <w:t xml:space="preserve">[ 8/2022 – </w:t>
                   </w:r>
                   <w:r>
-                    <w:t>Expected 12/2026</w:t>
+                    <w:t>Expected 12/</w:t>
+                  </w:r>
+                  <w:proofErr w:type="gramStart"/>
+                  <w:r>
+                    <w:t>2026</w:t>
                   </w:r>
                   <w:r>
                     <w:t xml:space="preserve"> ]</w:t>
                   </w:r>
+                  <w:proofErr w:type="gramEnd"/>
                 </w:p>
               </w:tc>
             </w:tr>
@@ -1383,8 +1388,13 @@
                     <w:keepNext w:val="0"/>
                   </w:pPr>
                   <w:r>
-                    <w:t>[ 1/2021 – 8/2022 ]</w:t>
-                  </w:r>
+                    <w:t>[ 1/2021 – 8/</w:t>
+                  </w:r>
+                  <w:proofErr w:type="gramStart"/>
+                  <w:r>
+                    <w:t>2022 ]</w:t>
+                  </w:r>
+                  <w:proofErr w:type="gramEnd"/>
                 </w:p>
               </w:tc>
             </w:tr>
@@ -1586,8 +1596,13 @@
                     <w:keepNext w:val="0"/>
                   </w:pPr>
                   <w:r>
-                    <w:t>[ 8/2012 – 5/2016 ]</w:t>
-                  </w:r>
+                    <w:t>[ 8/2012 – 5/</w:t>
+                  </w:r>
+                  <w:proofErr w:type="gramStart"/>
+                  <w:r>
+                    <w:t>2016 ]</w:t>
+                  </w:r>
+                  <w:proofErr w:type="gramEnd"/>
                 </w:p>
               </w:tc>
             </w:tr>
@@ -1751,8 +1766,13 @@
                     <w:keepNext w:val="0"/>
                   </w:pPr>
                   <w:r>
-                    <w:t>[ 8/2012 – 12/2016 ]</w:t>
-                  </w:r>
+                    <w:t>[ 8/2012 – 12/</w:t>
+                  </w:r>
+                  <w:proofErr w:type="gramStart"/>
+                  <w:r>
+                    <w:t>2016 ]</w:t>
+                  </w:r>
+                  <w:proofErr w:type="gramEnd"/>
                 </w:p>
               </w:tc>
             </w:tr>
@@ -1937,8 +1957,13 @@
                     <w:keepNext w:val="0"/>
                   </w:pPr>
                   <w:r>
-                    <w:t>[ 8/2021 – Present ]</w:t>
-                  </w:r>
+                    <w:t xml:space="preserve">[ 8/2021 – </w:t>
+                  </w:r>
+                  <w:proofErr w:type="gramStart"/>
+                  <w:r>
+                    <w:t>Present ]</w:t>
+                  </w:r>
+                  <w:proofErr w:type="gramEnd"/>
                 </w:p>
               </w:tc>
             </w:tr>
@@ -2123,11 +2148,16 @@
                     <w:t xml:space="preserve"> </w:t>
                   </w:r>
                   <w:r>
-                    <w:t>05/2023</w:t>
+                    <w:t>05/</w:t>
+                  </w:r>
+                  <w:proofErr w:type="gramStart"/>
+                  <w:r>
+                    <w:t>2023</w:t>
                   </w:r>
                   <w:r>
                     <w:t xml:space="preserve"> ]</w:t>
                   </w:r>
+                  <w:proofErr w:type="gramEnd"/>
                 </w:p>
               </w:tc>
             </w:tr>
@@ -2271,11 +2301,16 @@
                     <w:t xml:space="preserve">[ 2/2017 – </w:t>
                   </w:r>
                   <w:r>
-                    <w:t>9/2024</w:t>
+                    <w:t>9/</w:t>
+                  </w:r>
+                  <w:proofErr w:type="gramStart"/>
+                  <w:r>
+                    <w:t>2024</w:t>
                   </w:r>
                   <w:r>
                     <w:t xml:space="preserve"> ]</w:t>
                   </w:r>
+                  <w:proofErr w:type="gramEnd"/>
                 </w:p>
               </w:tc>
             </w:tr>
@@ -2398,7 +2433,15 @@
                     <w:keepNext w:val="0"/>
                   </w:pPr>
                   <w:r>
-                    <w:t xml:space="preserve">[ 7/2012 – 2/2017 ] </w:t>
+                    <w:t>[ 7/2012 – 2/</w:t>
+                  </w:r>
+                  <w:proofErr w:type="gramStart"/>
+                  <w:r>
+                    <w:t>2017 ]</w:t>
+                  </w:r>
+                  <w:proofErr w:type="gramEnd"/>
+                  <w:r>
+                    <w:t xml:space="preserve"> </w:t>
                   </w:r>
                 </w:p>
               </w:tc>
@@ -2525,8 +2568,13 @@
                     <w:t>7</w:t>
                   </w:r>
                   <w:r>
-                    <w:t>/2012 ]</w:t>
-                  </w:r>
+                    <w:t>/</w:t>
+                  </w:r>
+                  <w:proofErr w:type="gramStart"/>
+                  <w:r>
+                    <w:t>2012 ]</w:t>
+                  </w:r>
+                  <w:proofErr w:type="gramEnd"/>
                 </w:p>
               </w:tc>
             </w:tr>
@@ -3314,16 +3362,34 @@
                 <w:b w:val="0"/>
                 <w:bCs w:val="0"/>
               </w:rPr>
-              <w:t xml:space="preserve">Rising Star Seminar  </w:t>
-            </w:r>
-            <w:r>
-              <w:rPr>
-                <w:color w:val="4F81BD" w:themeColor="accent1"/>
-                <w:sz w:val="16"/>
-                <w:szCs w:val="16"/>
-              </w:rPr>
-              <w:t xml:space="preserve">[ </w:t>
-            </w:r>
+              <w:t xml:space="preserve">Rising Star </w:t>
+            </w:r>
+            <w:proofErr w:type="gramStart"/>
+            <w:r>
+              <w:rPr>
+                <w:b w:val="0"/>
+                <w:bCs w:val="0"/>
+              </w:rPr>
+              <w:t xml:space="preserve">Seminar  </w:t>
+            </w:r>
+            <w:r>
+              <w:rPr>
+                <w:color w:val="4F81BD" w:themeColor="accent1"/>
+                <w:sz w:val="16"/>
+                <w:szCs w:val="16"/>
+              </w:rPr>
+              <w:t>[</w:t>
+            </w:r>
+            <w:proofErr w:type="gramEnd"/>
+            <w:r>
+              <w:rPr>
+                <w:color w:val="4F81BD" w:themeColor="accent1"/>
+                <w:sz w:val="16"/>
+                <w:szCs w:val="16"/>
+              </w:rPr>
+              <w:t xml:space="preserve"> </w:t>
+            </w:r>
+            <w:proofErr w:type="gramStart"/>
             <w:r>
               <w:rPr>
                 <w:color w:val="4F81BD" w:themeColor="accent1"/>
@@ -3340,6 +3406,7 @@
               </w:rPr>
               <w:t xml:space="preserve"> ]</w:t>
             </w:r>
+            <w:proofErr w:type="gramEnd"/>
             <w:r>
               <w:rPr>
                 <w:color w:val="4F81BD" w:themeColor="accent1"/>
@@ -3401,16 +3468,34 @@
                 <w:b w:val="0"/>
                 <w:bCs w:val="0"/>
               </w:rPr>
-              <w:t xml:space="preserve">Advantage Austria Delegation  </w:t>
-            </w:r>
-            <w:r>
-              <w:rPr>
-                <w:color w:val="4F81BD" w:themeColor="accent1"/>
-                <w:sz w:val="16"/>
-                <w:szCs w:val="16"/>
-              </w:rPr>
-              <w:t xml:space="preserve">[ </w:t>
-            </w:r>
+              <w:t xml:space="preserve">Advantage Austria </w:t>
+            </w:r>
+            <w:proofErr w:type="gramStart"/>
+            <w:r>
+              <w:rPr>
+                <w:b w:val="0"/>
+                <w:bCs w:val="0"/>
+              </w:rPr>
+              <w:t xml:space="preserve">Delegation  </w:t>
+            </w:r>
+            <w:r>
+              <w:rPr>
+                <w:color w:val="4F81BD" w:themeColor="accent1"/>
+                <w:sz w:val="16"/>
+                <w:szCs w:val="16"/>
+              </w:rPr>
+              <w:t>[</w:t>
+            </w:r>
+            <w:proofErr w:type="gramEnd"/>
+            <w:r>
+              <w:rPr>
+                <w:color w:val="4F81BD" w:themeColor="accent1"/>
+                <w:sz w:val="16"/>
+                <w:szCs w:val="16"/>
+              </w:rPr>
+              <w:t xml:space="preserve"> </w:t>
+            </w:r>
+            <w:proofErr w:type="gramStart"/>
             <w:r>
               <w:rPr>
                 <w:color w:val="4F81BD" w:themeColor="accent1"/>
@@ -3427,6 +3512,7 @@
               </w:rPr>
               <w:t xml:space="preserve"> ]</w:t>
             </w:r>
+            <w:proofErr w:type="gramEnd"/>
             <w:r>
               <w:rPr>
                 <w:color w:val="4F81BD" w:themeColor="accent1"/>
@@ -3466,16 +3552,34 @@
                 <w:b w:val="0"/>
                 <w:bCs w:val="0"/>
               </w:rPr>
-              <w:t xml:space="preserve">ICEX Digital Innovator Accelerator  </w:t>
-            </w:r>
-            <w:r>
-              <w:rPr>
-                <w:color w:val="4F81BD" w:themeColor="accent1"/>
-                <w:sz w:val="16"/>
-                <w:szCs w:val="16"/>
-              </w:rPr>
-              <w:t xml:space="preserve">[ </w:t>
-            </w:r>
+              <w:t xml:space="preserve">ICEX Digital Innovator </w:t>
+            </w:r>
+            <w:proofErr w:type="gramStart"/>
+            <w:r>
+              <w:rPr>
+                <w:b w:val="0"/>
+                <w:bCs w:val="0"/>
+              </w:rPr>
+              <w:t xml:space="preserve">Accelerator  </w:t>
+            </w:r>
+            <w:r>
+              <w:rPr>
+                <w:color w:val="4F81BD" w:themeColor="accent1"/>
+                <w:sz w:val="16"/>
+                <w:szCs w:val="16"/>
+              </w:rPr>
+              <w:t>[</w:t>
+            </w:r>
+            <w:proofErr w:type="gramEnd"/>
+            <w:r>
+              <w:rPr>
+                <w:color w:val="4F81BD" w:themeColor="accent1"/>
+                <w:sz w:val="16"/>
+                <w:szCs w:val="16"/>
+              </w:rPr>
+              <w:t xml:space="preserve"> </w:t>
+            </w:r>
+            <w:proofErr w:type="gramStart"/>
             <w:r>
               <w:rPr>
                 <w:color w:val="4F81BD" w:themeColor="accent1"/>
@@ -3492,6 +3596,7 @@
               </w:rPr>
               <w:t xml:space="preserve"> ]</w:t>
             </w:r>
+            <w:proofErr w:type="gramEnd"/>
             <w:r>
               <w:rPr>
                 <w:color w:val="4F81BD" w:themeColor="accent1"/>
@@ -3547,6 +3652,7 @@
               </w:rPr>
               <w:t xml:space="preserve">Fellowship </w:t>
             </w:r>
+            <w:proofErr w:type="gramStart"/>
             <w:r>
               <w:rPr>
                 <w:b w:val="0"/>
@@ -3567,8 +3673,18 @@
                 <w:sz w:val="16"/>
                 <w:szCs w:val="16"/>
               </w:rPr>
-              <w:t xml:space="preserve">[ </w:t>
-            </w:r>
+              <w:t>[</w:t>
+            </w:r>
+            <w:proofErr w:type="gramEnd"/>
+            <w:r>
+              <w:rPr>
+                <w:color w:val="4F81BD" w:themeColor="accent1"/>
+                <w:sz w:val="16"/>
+                <w:szCs w:val="16"/>
+              </w:rPr>
+              <w:t xml:space="preserve"> </w:t>
+            </w:r>
+            <w:proofErr w:type="gramStart"/>
             <w:r>
               <w:rPr>
                 <w:color w:val="4F81BD" w:themeColor="accent1"/>
@@ -3585,6 +3701,7 @@
               </w:rPr>
               <w:t xml:space="preserve"> ]</w:t>
             </w:r>
+            <w:proofErr w:type="gramEnd"/>
             <w:r>
               <w:rPr>
                 <w:color w:val="4F81BD" w:themeColor="accent1"/>
@@ -3652,7 +3769,15 @@
                 <w:b w:val="0"/>
                 <w:bCs w:val="0"/>
               </w:rPr>
-              <w:t xml:space="preserve"> Events</w:t>
+              <w:t xml:space="preserve"> </w:t>
+            </w:r>
+            <w:proofErr w:type="gramStart"/>
+            <w:r>
+              <w:rPr>
+                <w:b w:val="0"/>
+                <w:bCs w:val="0"/>
+              </w:rPr>
+              <w:t>Events</w:t>
             </w:r>
             <w:r>
               <w:rPr>
@@ -3667,7 +3792,16 @@
                 <w:sz w:val="16"/>
                 <w:szCs w:val="16"/>
               </w:rPr>
-              <w:t xml:space="preserve">[ </w:t>
+              <w:t>[</w:t>
+            </w:r>
+            <w:proofErr w:type="gramEnd"/>
+            <w:r>
+              <w:rPr>
+                <w:color w:val="4F81BD" w:themeColor="accent1"/>
+                <w:sz w:val="16"/>
+                <w:szCs w:val="16"/>
+              </w:rPr>
+              <w:t xml:space="preserve"> </w:t>
             </w:r>
             <w:r>
               <w:rPr>
@@ -3685,6 +3819,7 @@
               </w:rPr>
               <w:t xml:space="preserve"> – </w:t>
             </w:r>
+            <w:proofErr w:type="gramStart"/>
             <w:r>
               <w:rPr>
                 <w:color w:val="4F81BD" w:themeColor="accent1"/>
@@ -3701,6 +3836,7 @@
               </w:rPr>
               <w:t>]</w:t>
             </w:r>
+            <w:proofErr w:type="gramEnd"/>
             <w:r>
               <w:rPr>
                 <w:color w:val="4F81BD" w:themeColor="accent1"/>
@@ -3736,7 +3872,15 @@
                 <w:b w:val="0"/>
                 <w:bCs w:val="0"/>
               </w:rPr>
-              <w:t>Fellowship Panels</w:t>
+              <w:t xml:space="preserve">Fellowship </w:t>
+            </w:r>
+            <w:proofErr w:type="gramStart"/>
+            <w:r>
+              <w:rPr>
+                <w:b w:val="0"/>
+                <w:bCs w:val="0"/>
+              </w:rPr>
+              <w:t>Panels</w:t>
             </w:r>
             <w:r>
               <w:rPr>
@@ -3751,7 +3895,16 @@
                 <w:sz w:val="16"/>
                 <w:szCs w:val="16"/>
               </w:rPr>
-              <w:t xml:space="preserve">[ </w:t>
+              <w:t>[</w:t>
+            </w:r>
+            <w:proofErr w:type="gramEnd"/>
+            <w:r>
+              <w:rPr>
+                <w:color w:val="4F81BD" w:themeColor="accent1"/>
+                <w:sz w:val="16"/>
+                <w:szCs w:val="16"/>
+              </w:rPr>
+              <w:t xml:space="preserve"> </w:t>
             </w:r>
             <w:r>
               <w:rPr>
@@ -3769,6 +3922,7 @@
               </w:rPr>
               <w:t xml:space="preserve"> – </w:t>
             </w:r>
+            <w:proofErr w:type="gramStart"/>
             <w:r>
               <w:rPr>
                 <w:color w:val="4F81BD" w:themeColor="accent1"/>
@@ -3785,6 +3939,7 @@
               </w:rPr>
               <w:t>]</w:t>
             </w:r>
+            <w:proofErr w:type="gramEnd"/>
             <w:r>
               <w:rPr>
                 <w:color w:val="4F81BD" w:themeColor="accent1"/>
@@ -3836,6 +3991,7 @@
               </w:rPr>
               <w:t xml:space="preserve">Research </w:t>
             </w:r>
+            <w:proofErr w:type="gramStart"/>
             <w:r>
               <w:rPr>
                 <w:b w:val="0"/>
@@ -3849,8 +4005,18 @@
                 <w:sz w:val="16"/>
                 <w:szCs w:val="16"/>
               </w:rPr>
-              <w:t xml:space="preserve">[ </w:t>
-            </w:r>
+              <w:t>[</w:t>
+            </w:r>
+            <w:proofErr w:type="gramEnd"/>
+            <w:r>
+              <w:rPr>
+                <w:color w:val="4F81BD" w:themeColor="accent1"/>
+                <w:sz w:val="16"/>
+                <w:szCs w:val="16"/>
+              </w:rPr>
+              <w:t xml:space="preserve"> </w:t>
+            </w:r>
+            <w:proofErr w:type="gramStart"/>
             <w:r>
               <w:rPr>
                 <w:color w:val="4F81BD" w:themeColor="accent1"/>
@@ -3873,8 +4039,18 @@
                 <w:sz w:val="16"/>
                 <w:szCs w:val="16"/>
               </w:rPr>
-              <w:t xml:space="preserve">  – </w:t>
-            </w:r>
+              <w:t xml:space="preserve">  –</w:t>
+            </w:r>
+            <w:proofErr w:type="gramEnd"/>
+            <w:r>
+              <w:rPr>
+                <w:color w:val="4F81BD" w:themeColor="accent1"/>
+                <w:sz w:val="16"/>
+                <w:szCs w:val="16"/>
+              </w:rPr>
+              <w:t xml:space="preserve"> </w:t>
+            </w:r>
+            <w:proofErr w:type="gramStart"/>
             <w:r>
               <w:rPr>
                 <w:color w:val="4F81BD" w:themeColor="accent1"/>
@@ -3891,6 +4067,7 @@
               </w:rPr>
               <w:t>]</w:t>
             </w:r>
+            <w:proofErr w:type="gramEnd"/>
             <w:r>
               <w:rPr>
                 <w:color w:val="4F81BD" w:themeColor="accent1"/>
@@ -3930,16 +4107,34 @@
                 <w:b w:val="0"/>
                 <w:bCs w:val="0"/>
               </w:rPr>
-              <w:t xml:space="preserve">Ukraine Delegation  </w:t>
-            </w:r>
-            <w:r>
-              <w:rPr>
-                <w:color w:val="4F81BD" w:themeColor="accent1"/>
-                <w:sz w:val="16"/>
-                <w:szCs w:val="16"/>
-              </w:rPr>
-              <w:t xml:space="preserve">[ </w:t>
-            </w:r>
+              <w:t xml:space="preserve">Ukraine </w:t>
+            </w:r>
+            <w:proofErr w:type="gramStart"/>
+            <w:r>
+              <w:rPr>
+                <w:b w:val="0"/>
+                <w:bCs w:val="0"/>
+              </w:rPr>
+              <w:t xml:space="preserve">Delegation  </w:t>
+            </w:r>
+            <w:r>
+              <w:rPr>
+                <w:color w:val="4F81BD" w:themeColor="accent1"/>
+                <w:sz w:val="16"/>
+                <w:szCs w:val="16"/>
+              </w:rPr>
+              <w:t>[</w:t>
+            </w:r>
+            <w:proofErr w:type="gramEnd"/>
+            <w:r>
+              <w:rPr>
+                <w:color w:val="4F81BD" w:themeColor="accent1"/>
+                <w:sz w:val="16"/>
+                <w:szCs w:val="16"/>
+              </w:rPr>
+              <w:t xml:space="preserve"> </w:t>
+            </w:r>
+            <w:proofErr w:type="gramStart"/>
             <w:r>
               <w:rPr>
                 <w:color w:val="4F81BD" w:themeColor="accent1"/>
@@ -3956,6 +4151,7 @@
               </w:rPr>
               <w:t xml:space="preserve"> ]</w:t>
             </w:r>
+            <w:proofErr w:type="gramEnd"/>
             <w:r>
               <w:rPr>
                 <w:color w:val="4F81BD" w:themeColor="accent1"/>
@@ -3995,16 +4191,34 @@
                 <w:b w:val="0"/>
                 <w:bCs w:val="0"/>
               </w:rPr>
-              <w:t xml:space="preserve">Taiwan Delegation  </w:t>
-            </w:r>
-            <w:r>
-              <w:rPr>
-                <w:color w:val="4F81BD" w:themeColor="accent1"/>
-                <w:sz w:val="16"/>
-                <w:szCs w:val="16"/>
-              </w:rPr>
-              <w:t xml:space="preserve">[ </w:t>
-            </w:r>
+              <w:t xml:space="preserve">Taiwan </w:t>
+            </w:r>
+            <w:proofErr w:type="gramStart"/>
+            <w:r>
+              <w:rPr>
+                <w:b w:val="0"/>
+                <w:bCs w:val="0"/>
+              </w:rPr>
+              <w:t xml:space="preserve">Delegation  </w:t>
+            </w:r>
+            <w:r>
+              <w:rPr>
+                <w:color w:val="4F81BD" w:themeColor="accent1"/>
+                <w:sz w:val="16"/>
+                <w:szCs w:val="16"/>
+              </w:rPr>
+              <w:t>[</w:t>
+            </w:r>
+            <w:proofErr w:type="gramEnd"/>
+            <w:r>
+              <w:rPr>
+                <w:color w:val="4F81BD" w:themeColor="accent1"/>
+                <w:sz w:val="16"/>
+                <w:szCs w:val="16"/>
+              </w:rPr>
+              <w:t xml:space="preserve"> </w:t>
+            </w:r>
+            <w:proofErr w:type="gramStart"/>
             <w:r>
               <w:rPr>
                 <w:color w:val="4F81BD" w:themeColor="accent1"/>
@@ -4021,6 +4235,7 @@
               </w:rPr>
               <w:t xml:space="preserve"> ]</w:t>
             </w:r>
+            <w:proofErr w:type="gramEnd"/>
             <w:r>
               <w:rPr>
                 <w:color w:val="4F81BD" w:themeColor="accent1"/>
@@ -4060,16 +4275,34 @@
                 <w:b w:val="0"/>
                 <w:bCs w:val="0"/>
               </w:rPr>
-              <w:t xml:space="preserve">International Conference on Learning Representations (ICLR)  </w:t>
-            </w:r>
-            <w:r>
-              <w:rPr>
-                <w:color w:val="4F81BD" w:themeColor="accent1"/>
-                <w:sz w:val="16"/>
-                <w:szCs w:val="16"/>
-              </w:rPr>
-              <w:t xml:space="preserve">[ </w:t>
-            </w:r>
+              <w:t>International Conference on Learning Representations (</w:t>
+            </w:r>
+            <w:proofErr w:type="gramStart"/>
+            <w:r>
+              <w:rPr>
+                <w:b w:val="0"/>
+                <w:bCs w:val="0"/>
+              </w:rPr>
+              <w:t xml:space="preserve">ICLR)  </w:t>
+            </w:r>
+            <w:r>
+              <w:rPr>
+                <w:color w:val="4F81BD" w:themeColor="accent1"/>
+                <w:sz w:val="16"/>
+                <w:szCs w:val="16"/>
+              </w:rPr>
+              <w:t>[</w:t>
+            </w:r>
+            <w:proofErr w:type="gramEnd"/>
+            <w:r>
+              <w:rPr>
+                <w:color w:val="4F81BD" w:themeColor="accent1"/>
+                <w:sz w:val="16"/>
+                <w:szCs w:val="16"/>
+              </w:rPr>
+              <w:t xml:space="preserve"> </w:t>
+            </w:r>
+            <w:proofErr w:type="gramStart"/>
             <w:r>
               <w:rPr>
                 <w:color w:val="4F81BD" w:themeColor="accent1"/>
@@ -4086,6 +4319,7 @@
               </w:rPr>
               <w:t xml:space="preserve"> ]</w:t>
             </w:r>
+            <w:proofErr w:type="gramEnd"/>
             <w:r>
               <w:rPr>
                 <w:color w:val="4F81BD" w:themeColor="accent1"/>
@@ -4125,16 +4359,34 @@
                 <w:b w:val="0"/>
                 <w:bCs w:val="0"/>
               </w:rPr>
-              <w:t xml:space="preserve">AWS Quantum Networks Workshop (QNW)  </w:t>
-            </w:r>
-            <w:r>
-              <w:rPr>
-                <w:color w:val="4F81BD" w:themeColor="accent1"/>
-                <w:sz w:val="16"/>
-                <w:szCs w:val="16"/>
-              </w:rPr>
-              <w:t xml:space="preserve">[ </w:t>
-            </w:r>
+              <w:t>AWS Quantum Networks Workshop (</w:t>
+            </w:r>
+            <w:proofErr w:type="gramStart"/>
+            <w:r>
+              <w:rPr>
+                <w:b w:val="0"/>
+                <w:bCs w:val="0"/>
+              </w:rPr>
+              <w:t xml:space="preserve">QNW)  </w:t>
+            </w:r>
+            <w:r>
+              <w:rPr>
+                <w:color w:val="4F81BD" w:themeColor="accent1"/>
+                <w:sz w:val="16"/>
+                <w:szCs w:val="16"/>
+              </w:rPr>
+              <w:t>[</w:t>
+            </w:r>
+            <w:proofErr w:type="gramEnd"/>
+            <w:r>
+              <w:rPr>
+                <w:color w:val="4F81BD" w:themeColor="accent1"/>
+                <w:sz w:val="16"/>
+                <w:szCs w:val="16"/>
+              </w:rPr>
+              <w:t xml:space="preserve"> </w:t>
+            </w:r>
+            <w:proofErr w:type="gramStart"/>
             <w:r>
               <w:rPr>
                 <w:color w:val="4F81BD" w:themeColor="accent1"/>
@@ -4151,6 +4403,7 @@
               </w:rPr>
               <w:t xml:space="preserve"> ]</w:t>
             </w:r>
+            <w:proofErr w:type="gramEnd"/>
             <w:r>
               <w:rPr>
                 <w:color w:val="4F81BD" w:themeColor="accent1"/>
@@ -4201,16 +4454,34 @@
                 <w:b w:val="0"/>
                 <w:bCs w:val="0"/>
               </w:rPr>
-              <w:t xml:space="preserve"> Workshop  </w:t>
-            </w:r>
-            <w:r>
-              <w:rPr>
-                <w:color w:val="4F81BD" w:themeColor="accent1"/>
-                <w:sz w:val="16"/>
-                <w:szCs w:val="16"/>
-              </w:rPr>
-              <w:t xml:space="preserve">[ </w:t>
-            </w:r>
+              <w:t xml:space="preserve"> </w:t>
+            </w:r>
+            <w:proofErr w:type="gramStart"/>
+            <w:r>
+              <w:rPr>
+                <w:b w:val="0"/>
+                <w:bCs w:val="0"/>
+              </w:rPr>
+              <w:t xml:space="preserve">Workshop  </w:t>
+            </w:r>
+            <w:r>
+              <w:rPr>
+                <w:color w:val="4F81BD" w:themeColor="accent1"/>
+                <w:sz w:val="16"/>
+                <w:szCs w:val="16"/>
+              </w:rPr>
+              <w:t>[</w:t>
+            </w:r>
+            <w:proofErr w:type="gramEnd"/>
+            <w:r>
+              <w:rPr>
+                <w:color w:val="4F81BD" w:themeColor="accent1"/>
+                <w:sz w:val="16"/>
+                <w:szCs w:val="16"/>
+              </w:rPr>
+              <w:t xml:space="preserve"> </w:t>
+            </w:r>
+            <w:proofErr w:type="gramStart"/>
             <w:r>
               <w:rPr>
                 <w:color w:val="4F81BD" w:themeColor="accent1"/>
@@ -4227,6 +4498,7 @@
               </w:rPr>
               <w:t xml:space="preserve"> ]</w:t>
             </w:r>
+            <w:proofErr w:type="gramEnd"/>
             <w:r>
               <w:rPr>
                 <w:color w:val="4F81BD" w:themeColor="accent1"/>
@@ -4266,16 +4538,34 @@
                 <w:b w:val="0"/>
                 <w:bCs w:val="0"/>
               </w:rPr>
-              <w:t xml:space="preserve">International Laser Ranging Service (ILRS) Technical Workshop  </w:t>
-            </w:r>
-            <w:r>
-              <w:rPr>
-                <w:color w:val="4F81BD" w:themeColor="accent1"/>
-                <w:sz w:val="16"/>
-                <w:szCs w:val="16"/>
-              </w:rPr>
-              <w:t xml:space="preserve">[ </w:t>
-            </w:r>
+              <w:t xml:space="preserve">International Laser Ranging Service (ILRS) Technical </w:t>
+            </w:r>
+            <w:proofErr w:type="gramStart"/>
+            <w:r>
+              <w:rPr>
+                <w:b w:val="0"/>
+                <w:bCs w:val="0"/>
+              </w:rPr>
+              <w:t xml:space="preserve">Workshop  </w:t>
+            </w:r>
+            <w:r>
+              <w:rPr>
+                <w:color w:val="4F81BD" w:themeColor="accent1"/>
+                <w:sz w:val="16"/>
+                <w:szCs w:val="16"/>
+              </w:rPr>
+              <w:t>[</w:t>
+            </w:r>
+            <w:proofErr w:type="gramEnd"/>
+            <w:r>
+              <w:rPr>
+                <w:color w:val="4F81BD" w:themeColor="accent1"/>
+                <w:sz w:val="16"/>
+                <w:szCs w:val="16"/>
+              </w:rPr>
+              <w:t xml:space="preserve"> </w:t>
+            </w:r>
+            <w:proofErr w:type="gramStart"/>
             <w:r>
               <w:rPr>
                 <w:color w:val="4F81BD" w:themeColor="accent1"/>
@@ -4292,6 +4582,7 @@
               </w:rPr>
               <w:t xml:space="preserve"> ]</w:t>
             </w:r>
+            <w:proofErr w:type="gramEnd"/>
             <w:r>
               <w:rPr>
                 <w:color w:val="4F81BD" w:themeColor="accent1"/>
@@ -4331,15 +4622,32 @@
                 <w:b w:val="0"/>
                 <w:bCs w:val="0"/>
               </w:rPr>
-              <w:t xml:space="preserve">NRL Research Presentations and Performance Reviews  </w:t>
-            </w:r>
-            <w:r>
-              <w:rPr>
-                <w:color w:val="4F81BD" w:themeColor="accent1"/>
-                <w:sz w:val="16"/>
-                <w:szCs w:val="16"/>
-              </w:rPr>
-              <w:t>[ 201</w:t>
+              <w:t xml:space="preserve">NRL Research Presentations and Performance </w:t>
+            </w:r>
+            <w:proofErr w:type="gramStart"/>
+            <w:r>
+              <w:rPr>
+                <w:b w:val="0"/>
+                <w:bCs w:val="0"/>
+              </w:rPr>
+              <w:t xml:space="preserve">Reviews  </w:t>
+            </w:r>
+            <w:r>
+              <w:rPr>
+                <w:color w:val="4F81BD" w:themeColor="accent1"/>
+                <w:sz w:val="16"/>
+                <w:szCs w:val="16"/>
+              </w:rPr>
+              <w:t>[</w:t>
+            </w:r>
+            <w:proofErr w:type="gramEnd"/>
+            <w:r>
+              <w:rPr>
+                <w:color w:val="4F81BD" w:themeColor="accent1"/>
+                <w:sz w:val="16"/>
+                <w:szCs w:val="16"/>
+              </w:rPr>
+              <w:t xml:space="preserve"> 201</w:t>
             </w:r>
             <w:r>
               <w:rPr>
@@ -4357,13 +4665,23 @@
               </w:rPr>
               <w:t xml:space="preserve"> – </w:t>
             </w:r>
-            <w:r>
-              <w:rPr>
-                <w:color w:val="4F81BD" w:themeColor="accent1"/>
-                <w:sz w:val="16"/>
-                <w:szCs w:val="16"/>
-              </w:rPr>
-              <w:t xml:space="preserve">2024 ]  </w:t>
+            <w:proofErr w:type="gramStart"/>
+            <w:r>
+              <w:rPr>
+                <w:color w:val="4F81BD" w:themeColor="accent1"/>
+                <w:sz w:val="16"/>
+                <w:szCs w:val="16"/>
+              </w:rPr>
+              <w:t>2024 ]</w:t>
+            </w:r>
+            <w:proofErr w:type="gramEnd"/>
+            <w:r>
+              <w:rPr>
+                <w:color w:val="4F81BD" w:themeColor="accent1"/>
+                <w:sz w:val="16"/>
+                <w:szCs w:val="16"/>
+              </w:rPr>
+              <w:t xml:space="preserve">  </w:t>
             </w:r>
             <w:r>
               <w:rPr>
@@ -4587,16 +4905,30 @@
               <w:keepNext w:val="0"/>
             </w:pPr>
             <w:r>
-              <w:t xml:space="preserve">Peer Mentorship  </w:t>
-            </w:r>
-            <w:r>
-              <w:rPr>
-                <w:color w:val="4F81BD" w:themeColor="accent1"/>
-                <w:sz w:val="16"/>
-                <w:szCs w:val="16"/>
-              </w:rPr>
-              <w:t xml:space="preserve">[ </w:t>
-            </w:r>
+              <w:t xml:space="preserve">Peer </w:t>
+            </w:r>
+            <w:proofErr w:type="gramStart"/>
+            <w:r>
+              <w:t xml:space="preserve">Mentorship  </w:t>
+            </w:r>
+            <w:r>
+              <w:rPr>
+                <w:color w:val="4F81BD" w:themeColor="accent1"/>
+                <w:sz w:val="16"/>
+                <w:szCs w:val="16"/>
+              </w:rPr>
+              <w:t>[</w:t>
+            </w:r>
+            <w:proofErr w:type="gramEnd"/>
+            <w:r>
+              <w:rPr>
+                <w:color w:val="4F81BD" w:themeColor="accent1"/>
+                <w:sz w:val="16"/>
+                <w:szCs w:val="16"/>
+              </w:rPr>
+              <w:t xml:space="preserve"> </w:t>
+            </w:r>
+            <w:proofErr w:type="gramStart"/>
             <w:r>
               <w:rPr>
                 <w:color w:val="4F81BD" w:themeColor="accent1"/>
@@ -4611,8 +4943,18 @@
                 <w:sz w:val="16"/>
                 <w:szCs w:val="16"/>
               </w:rPr>
-              <w:t xml:space="preserve">  – </w:t>
-            </w:r>
+              <w:t xml:space="preserve">  –</w:t>
+            </w:r>
+            <w:proofErr w:type="gramEnd"/>
+            <w:r>
+              <w:rPr>
+                <w:color w:val="4F81BD" w:themeColor="accent1"/>
+                <w:sz w:val="16"/>
+                <w:szCs w:val="16"/>
+              </w:rPr>
+              <w:t xml:space="preserve"> </w:t>
+            </w:r>
+            <w:proofErr w:type="gramStart"/>
             <w:r>
               <w:rPr>
                 <w:color w:val="4F81BD" w:themeColor="accent1"/>
@@ -4629,6 +4971,7 @@
               </w:rPr>
               <w:t>]</w:t>
             </w:r>
+            <w:proofErr w:type="gramEnd"/>
             <w:r>
               <w:rPr>
                 <w:color w:val="4F81BD" w:themeColor="accent1"/>
@@ -4655,7 +4998,11 @@
               <w:keepNext w:val="0"/>
             </w:pPr>
             <w:r>
-              <w:t>University and Department Tours</w:t>
+              <w:t xml:space="preserve">University and Department </w:t>
+            </w:r>
+            <w:proofErr w:type="gramStart"/>
+            <w:r>
+              <w:t>Tours</w:t>
             </w:r>
             <w:r>
               <w:rPr>
@@ -4670,8 +5017,18 @@
                 <w:sz w:val="16"/>
                 <w:szCs w:val="16"/>
               </w:rPr>
-              <w:t xml:space="preserve">[ </w:t>
-            </w:r>
+              <w:t>[</w:t>
+            </w:r>
+            <w:proofErr w:type="gramEnd"/>
+            <w:r>
+              <w:rPr>
+                <w:color w:val="4F81BD" w:themeColor="accent1"/>
+                <w:sz w:val="16"/>
+                <w:szCs w:val="16"/>
+              </w:rPr>
+              <w:t xml:space="preserve"> </w:t>
+            </w:r>
+            <w:proofErr w:type="gramStart"/>
             <w:r>
               <w:rPr>
                 <w:color w:val="4F81BD" w:themeColor="accent1"/>
@@ -4686,8 +5043,18 @@
                 <w:sz w:val="16"/>
                 <w:szCs w:val="16"/>
               </w:rPr>
-              <w:t xml:space="preserve">  – </w:t>
-            </w:r>
+              <w:t xml:space="preserve">  –</w:t>
+            </w:r>
+            <w:proofErr w:type="gramEnd"/>
+            <w:r>
+              <w:rPr>
+                <w:color w:val="4F81BD" w:themeColor="accent1"/>
+                <w:sz w:val="16"/>
+                <w:szCs w:val="16"/>
+              </w:rPr>
+              <w:t xml:space="preserve"> </w:t>
+            </w:r>
+            <w:proofErr w:type="gramStart"/>
             <w:r>
               <w:rPr>
                 <w:color w:val="4F81BD" w:themeColor="accent1"/>
@@ -4704,6 +5071,7 @@
               </w:rPr>
               <w:t>]</w:t>
             </w:r>
+            <w:proofErr w:type="gramEnd"/>
             <w:r>
               <w:rPr>
                 <w:color w:val="4F81BD" w:themeColor="accent1"/>
@@ -4753,16 +5121,34 @@
                 <w:b w:val="0"/>
                 <w:bCs w:val="0"/>
               </w:rPr>
-              <w:t xml:space="preserve"> Kappa Nu  </w:t>
-            </w:r>
-            <w:r>
-              <w:rPr>
-                <w:color w:val="4F81BD" w:themeColor="accent1"/>
-                <w:sz w:val="16"/>
-                <w:szCs w:val="16"/>
-              </w:rPr>
-              <w:t xml:space="preserve">[ </w:t>
-            </w:r>
+              <w:t xml:space="preserve"> Kappa </w:t>
+            </w:r>
+            <w:proofErr w:type="gramStart"/>
+            <w:r>
+              <w:rPr>
+                <w:b w:val="0"/>
+                <w:bCs w:val="0"/>
+              </w:rPr>
+              <w:t xml:space="preserve">Nu  </w:t>
+            </w:r>
+            <w:r>
+              <w:rPr>
+                <w:color w:val="4F81BD" w:themeColor="accent1"/>
+                <w:sz w:val="16"/>
+                <w:szCs w:val="16"/>
+              </w:rPr>
+              <w:t>[</w:t>
+            </w:r>
+            <w:proofErr w:type="gramEnd"/>
+            <w:r>
+              <w:rPr>
+                <w:color w:val="4F81BD" w:themeColor="accent1"/>
+                <w:sz w:val="16"/>
+                <w:szCs w:val="16"/>
+              </w:rPr>
+              <w:t xml:space="preserve"> </w:t>
+            </w:r>
+            <w:proofErr w:type="gramStart"/>
             <w:r>
               <w:rPr>
                 <w:color w:val="4F81BD" w:themeColor="accent1"/>
@@ -4779,6 +5165,7 @@
               </w:rPr>
               <w:t xml:space="preserve"> ]</w:t>
             </w:r>
+            <w:proofErr w:type="gramEnd"/>
             <w:r>
               <w:rPr>
                 <w:color w:val="4F81BD" w:themeColor="accent1"/>
@@ -4951,8 +5338,13 @@
                     <w:keepNext w:val="0"/>
                   </w:pPr>
                   <w:r>
-                    <w:t>[ 6/2026 ]</w:t>
-                  </w:r>
+                    <w:t>[ 6/</w:t>
+                  </w:r>
+                  <w:proofErr w:type="gramStart"/>
+                  <w:r>
+                    <w:t>2026 ]</w:t>
+                  </w:r>
+                  <w:proofErr w:type="gramEnd"/>
                 </w:p>
               </w:tc>
             </w:tr>
@@ -5230,8 +5622,13 @@
                     <w:keepNext w:val="0"/>
                   </w:pPr>
                   <w:r>
-                    <w:t>[ 4/2025 ]</w:t>
-                  </w:r>
+                    <w:t>[ 4/</w:t>
+                  </w:r>
+                  <w:proofErr w:type="gramStart"/>
+                  <w:r>
+                    <w:t>2025 ]</w:t>
+                  </w:r>
+                  <w:proofErr w:type="gramEnd"/>
                 </w:p>
               </w:tc>
             </w:tr>
@@ -5383,8 +5780,13 @@
                     <w:keepNext w:val="0"/>
                   </w:pPr>
                   <w:r>
-                    <w:t>[ 3/2023 ]</w:t>
-                  </w:r>
+                    <w:t>[ 3/</w:t>
+                  </w:r>
+                  <w:proofErr w:type="gramStart"/>
+                  <w:r>
+                    <w:t>2023 ]</w:t>
+                  </w:r>
+                  <w:proofErr w:type="gramEnd"/>
                 </w:p>
               </w:tc>
             </w:tr>
@@ -5518,8 +5920,13 @@
                     <w:keepNext w:val="0"/>
                   </w:pPr>
                   <w:r>
-                    <w:t>[ 1/2021 – 8/2022 ]</w:t>
-                  </w:r>
+                    <w:t>[ 1/2021 – 8/</w:t>
+                  </w:r>
+                  <w:proofErr w:type="gramStart"/>
+                  <w:r>
+                    <w:t>2022 ]</w:t>
+                  </w:r>
+                  <w:proofErr w:type="gramEnd"/>
                 </w:p>
               </w:tc>
             </w:tr>
@@ -5656,8 +6063,13 @@
                     <w:keepNext w:val="0"/>
                   </w:pPr>
                   <w:r>
-                    <w:t>[ 10/2021 – 12/2021 ]</w:t>
-                  </w:r>
+                    <w:t>[ 10/2021 – 12/</w:t>
+                  </w:r>
+                  <w:proofErr w:type="gramStart"/>
+                  <w:r>
+                    <w:t>2021 ]</w:t>
+                  </w:r>
+                  <w:proofErr w:type="gramEnd"/>
                 </w:p>
               </w:tc>
             </w:tr>
@@ -5773,8 +6185,13 @@
                     <w:keepNext w:val="0"/>
                   </w:pPr>
                   <w:r>
-                    <w:t>[ 4/2021 – 5/2021 ]</w:t>
-                  </w:r>
+                    <w:t>[ 4/2021 – 5/</w:t>
+                  </w:r>
+                  <w:proofErr w:type="gramStart"/>
+                  <w:r>
+                    <w:t>2021 ]</w:t>
+                  </w:r>
+                  <w:proofErr w:type="gramEnd"/>
                 </w:p>
               </w:tc>
             </w:tr>
@@ -5885,8 +6302,13 @@
                     <w:keepNext w:val="0"/>
                   </w:pPr>
                   <w:r>
-                    <w:t>[ 8/2016 – 12/2016 ]</w:t>
-                  </w:r>
+                    <w:t>[ 8/2016 – 12/</w:t>
+                  </w:r>
+                  <w:proofErr w:type="gramStart"/>
+                  <w:r>
+                    <w:t>2016 ]</w:t>
+                  </w:r>
+                  <w:proofErr w:type="gramEnd"/>
                 </w:p>
               </w:tc>
             </w:tr>
@@ -5997,7 +6419,15 @@
                     <w:keepNext w:val="0"/>
                   </w:pPr>
                   <w:r>
-                    <w:t xml:space="preserve">[ 8/2015 – 5/2016 ] </w:t>
+                    <w:t>[ 8/2015 – 5/</w:t>
+                  </w:r>
+                  <w:proofErr w:type="gramStart"/>
+                  <w:r>
+                    <w:t>2016 ]</w:t>
+                  </w:r>
+                  <w:proofErr w:type="gramEnd"/>
+                  <w:r>
+                    <w:t xml:space="preserve"> </w:t>
                   </w:r>
                 </w:p>
               </w:tc>
@@ -6013,7 +6443,15 @@
                     <w:pStyle w:val="Content"/>
                   </w:pPr>
                   <w:r>
-                    <w:t xml:space="preserve">Created a wireless off-the-shelf device for interfacing with vehicle OBDII system. Developed companion Linux and mobile application software for wireless data acquisition and interaction. Learned project management, project documentation such as request for proposal, and customer relations from instructors that have extensive backgrounds in the corporate world. </w:t>
+                    <w:t xml:space="preserve">Created a wireless off-the-shelf device for interfacing with vehicle OBDII system. Developed companion Linux and mobile application software for wireless data acquisition and interaction. Learned project management, project documentation such as </w:t>
+                  </w:r>
+                  <w:proofErr w:type="gramStart"/>
+                  <w:r>
+                    <w:t>request</w:t>
+                  </w:r>
+                  <w:proofErr w:type="gramEnd"/>
+                  <w:r>
+                    <w:t xml:space="preserve"> for proposal, and customer relations from instructors that have extensive backgrounds in the corporate world. </w:t>
                   </w:r>
                 </w:p>
               </w:tc>
@@ -6115,8 +6553,13 @@
                     <w:keepNext w:val="0"/>
                   </w:pPr>
                   <w:r>
-                    <w:t>[ 1/2015 – 5/2015 ]</w:t>
-                  </w:r>
+                    <w:t>[ 1/2015 – 5/</w:t>
+                  </w:r>
+                  <w:proofErr w:type="gramStart"/>
+                  <w:r>
+                    <w:t>2015 ]</w:t>
+                  </w:r>
+                  <w:proofErr w:type="gramEnd"/>
                 </w:p>
               </w:tc>
             </w:tr>
@@ -6131,7 +6574,15 @@
                     <w:pStyle w:val="Content"/>
                   </w:pPr>
                   <w:r>
-                    <w:t>Developed a RTL-SDR receiver system called ‘</w:t>
+                    <w:t xml:space="preserve">Developed </w:t>
+                  </w:r>
+                  <w:proofErr w:type="gramStart"/>
+                  <w:r>
+                    <w:t>a</w:t>
+                  </w:r>
+                  <w:proofErr w:type="gramEnd"/>
+                  <w:r>
+                    <w:t xml:space="preserve"> RTL-SDR receiver system called ‘</w:t>
                   </w:r>
                   <w:proofErr w:type="spellStart"/>
                   <w:r>
@@ -6249,8 +6700,13 @@
                     <w:keepNext w:val="0"/>
                   </w:pPr>
                   <w:r>
-                    <w:t>[ 7/2015 – 08/2015 ]</w:t>
-                  </w:r>
+                    <w:t>[ 7/2015 – 08/</w:t>
+                  </w:r>
+                  <w:proofErr w:type="gramStart"/>
+                  <w:r>
+                    <w:t>2015 ]</w:t>
+                  </w:r>
+                  <w:proofErr w:type="gramEnd"/>
                 </w:p>
               </w:tc>
             </w:tr>
@@ -8004,7 +8460,15 @@
                 <w:b w:val="0"/>
                 <w:bCs w:val="0"/>
               </w:rPr>
-              <w:t>IEEE Honor Society</w:t>
+              <w:t xml:space="preserve">IEEE Honor </w:t>
+            </w:r>
+            <w:proofErr w:type="gramStart"/>
+            <w:r>
+              <w:rPr>
+                <w:b w:val="0"/>
+                <w:bCs w:val="0"/>
+              </w:rPr>
+              <w:t>Society</w:t>
             </w:r>
             <w:r>
               <w:t xml:space="preserve">  </w:t>
@@ -8015,8 +8479,27 @@
                 <w:sz w:val="16"/>
                 <w:szCs w:val="24"/>
               </w:rPr>
-              <w:t>[ 2021 – Present ]</w:t>
-            </w:r>
+              <w:t>[</w:t>
+            </w:r>
+            <w:proofErr w:type="gramEnd"/>
+            <w:r>
+              <w:rPr>
+                <w:color w:val="4F81BD" w:themeColor="accent1"/>
+                <w:sz w:val="16"/>
+                <w:szCs w:val="24"/>
+              </w:rPr>
+              <w:t xml:space="preserve"> 2021 – </w:t>
+            </w:r>
+            <w:proofErr w:type="gramStart"/>
+            <w:r>
+              <w:rPr>
+                <w:color w:val="4F81BD" w:themeColor="accent1"/>
+                <w:sz w:val="16"/>
+                <w:szCs w:val="24"/>
+              </w:rPr>
+              <w:t>Present ]</w:t>
+            </w:r>
+            <w:proofErr w:type="gramEnd"/>
           </w:p>
           <w:p>
             <w:pPr>
@@ -8027,6 +8510,7 @@
                 <w:szCs w:val="10"/>
               </w:rPr>
             </w:pPr>
+            <w:proofErr w:type="gramStart"/>
             <w:r>
               <w:t xml:space="preserve">IEEE  </w:t>
             </w:r>
@@ -8036,8 +8520,27 @@
                 <w:sz w:val="16"/>
                 <w:szCs w:val="24"/>
               </w:rPr>
-              <w:t>[ 2021 – Present ]</w:t>
-            </w:r>
+              <w:t>[</w:t>
+            </w:r>
+            <w:proofErr w:type="gramEnd"/>
+            <w:r>
+              <w:rPr>
+                <w:color w:val="4F81BD" w:themeColor="accent1"/>
+                <w:sz w:val="16"/>
+                <w:szCs w:val="24"/>
+              </w:rPr>
+              <w:t xml:space="preserve"> 2021 – </w:t>
+            </w:r>
+            <w:proofErr w:type="gramStart"/>
+            <w:r>
+              <w:rPr>
+                <w:color w:val="4F81BD" w:themeColor="accent1"/>
+                <w:sz w:val="16"/>
+                <w:szCs w:val="24"/>
+              </w:rPr>
+              <w:t>Present ]</w:t>
+            </w:r>
+            <w:proofErr w:type="gramEnd"/>
           </w:p>
         </w:tc>
       </w:tr>
@@ -8165,7 +8668,15 @@
                 <w:b w:val="0"/>
                 <w:bCs w:val="0"/>
               </w:rPr>
-              <w:t>Department of Electrical and Computer Engineering</w:t>
+              <w:t xml:space="preserve">Department of Electrical and Computer </w:t>
+            </w:r>
+            <w:proofErr w:type="gramStart"/>
+            <w:r>
+              <w:rPr>
+                <w:b w:val="0"/>
+                <w:bCs w:val="0"/>
+              </w:rPr>
+              <w:t>Engineering</w:t>
             </w:r>
             <w:r>
               <w:t xml:space="preserve"> </w:t>
@@ -8179,14 +8690,23 @@
                 <w:sz w:val="16"/>
                 <w:szCs w:val="24"/>
               </w:rPr>
-              <w:t>[ 202</w:t>
-            </w:r>
+              <w:t>[</w:t>
+            </w:r>
+            <w:proofErr w:type="gramEnd"/>
             <w:r>
               <w:rPr>
                 <w:color w:val="4F81BD" w:themeColor="accent1"/>
                 <w:sz w:val="16"/>
                 <w:szCs w:val="24"/>
               </w:rPr>
+              <w:t xml:space="preserve"> 202</w:t>
+            </w:r>
+            <w:r>
+              <w:rPr>
+                <w:color w:val="4F81BD" w:themeColor="accent1"/>
+                <w:sz w:val="16"/>
+                <w:szCs w:val="24"/>
+              </w:rPr>
               <w:t>2</w:t>
             </w:r>
             <w:r>
@@ -8195,8 +8715,18 @@
                 <w:sz w:val="16"/>
                 <w:szCs w:val="24"/>
               </w:rPr>
-              <w:t xml:space="preserve"> – Present ]</w:t>
-            </w:r>
+              <w:t xml:space="preserve"> – </w:t>
+            </w:r>
+            <w:proofErr w:type="gramStart"/>
+            <w:r>
+              <w:rPr>
+                <w:color w:val="4F81BD" w:themeColor="accent1"/>
+                <w:sz w:val="16"/>
+                <w:szCs w:val="24"/>
+              </w:rPr>
+              <w:t>Present ]</w:t>
+            </w:r>
+            <w:proofErr w:type="gramEnd"/>
           </w:p>
           <w:p>
             <w:pPr>
@@ -8642,7 +9172,15 @@
                 <w:b w:val="0"/>
                 <w:bCs w:val="0"/>
               </w:rPr>
-              <w:t>employment, Virginia Tech</w:t>
+              <w:t xml:space="preserve">employment, Virginia </w:t>
+            </w:r>
+            <w:proofErr w:type="gramStart"/>
+            <w:r>
+              <w:rPr>
+                <w:b w:val="0"/>
+                <w:bCs w:val="0"/>
+              </w:rPr>
+              <w:t>Tech</w:t>
             </w:r>
             <w:r>
               <w:t xml:space="preserve">  </w:t>
@@ -8653,7 +9191,16 @@
                 <w:sz w:val="16"/>
                 <w:szCs w:val="16"/>
               </w:rPr>
-              <w:t xml:space="preserve">[ </w:t>
+              <w:t>[</w:t>
+            </w:r>
+            <w:proofErr w:type="gramEnd"/>
+            <w:r>
+              <w:rPr>
+                <w:color w:val="4F81BD" w:themeColor="accent1"/>
+                <w:sz w:val="16"/>
+                <w:szCs w:val="16"/>
+              </w:rPr>
+              <w:t xml:space="preserve"> </w:t>
             </w:r>
             <w:r>
               <w:rPr>
@@ -8677,15 +9224,33 @@
                 <w:sz w:val="16"/>
                 <w:szCs w:val="16"/>
               </w:rPr>
-              <w:t>12/2016</w:t>
-            </w:r>
-            <w:r>
-              <w:rPr>
-                <w:color w:val="4F81BD" w:themeColor="accent1"/>
-                <w:sz w:val="16"/>
-                <w:szCs w:val="16"/>
-              </w:rPr>
-              <w:t xml:space="preserve"> ] </w:t>
+              <w:t>12/</w:t>
+            </w:r>
+            <w:proofErr w:type="gramStart"/>
+            <w:r>
+              <w:rPr>
+                <w:color w:val="4F81BD" w:themeColor="accent1"/>
+                <w:sz w:val="16"/>
+                <w:szCs w:val="16"/>
+              </w:rPr>
+              <w:t>2016</w:t>
+            </w:r>
+            <w:r>
+              <w:rPr>
+                <w:color w:val="4F81BD" w:themeColor="accent1"/>
+                <w:sz w:val="16"/>
+                <w:szCs w:val="16"/>
+              </w:rPr>
+              <w:t xml:space="preserve"> ]</w:t>
+            </w:r>
+            <w:proofErr w:type="gramEnd"/>
+            <w:r>
+              <w:rPr>
+                <w:color w:val="4F81BD" w:themeColor="accent1"/>
+                <w:sz w:val="16"/>
+                <w:szCs w:val="16"/>
+              </w:rPr>
+              <w:t xml:space="preserve"> </w:t>
             </w:r>
             <w:r>
               <w:rPr>
@@ -8755,7 +9320,15 @@
                 <w:b w:val="0"/>
                 <w:bCs w:val="0"/>
               </w:rPr>
-              <w:t>, employment, Germanna Community College</w:t>
+              <w:t xml:space="preserve">, employment, Germanna Community </w:t>
+            </w:r>
+            <w:proofErr w:type="gramStart"/>
+            <w:r>
+              <w:rPr>
+                <w:b w:val="0"/>
+                <w:bCs w:val="0"/>
+              </w:rPr>
+              <w:t>College</w:t>
             </w:r>
             <w:r>
               <w:t xml:space="preserve">  </w:t>
@@ -8766,7 +9339,16 @@
                 <w:sz w:val="16"/>
                 <w:szCs w:val="16"/>
               </w:rPr>
-              <w:t xml:space="preserve">[ </w:t>
+              <w:t>[</w:t>
+            </w:r>
+            <w:proofErr w:type="gramEnd"/>
+            <w:r>
+              <w:rPr>
+                <w:color w:val="4F81BD" w:themeColor="accent1"/>
+                <w:sz w:val="16"/>
+                <w:szCs w:val="16"/>
+              </w:rPr>
+              <w:t xml:space="preserve"> </w:t>
             </w:r>
             <w:r>
               <w:rPr>
@@ -8790,15 +9372,33 @@
                 <w:sz w:val="16"/>
                 <w:szCs w:val="16"/>
               </w:rPr>
-              <w:t>5/2012</w:t>
-            </w:r>
-            <w:r>
-              <w:rPr>
-                <w:color w:val="4F81BD" w:themeColor="accent1"/>
-                <w:sz w:val="16"/>
-                <w:szCs w:val="16"/>
-              </w:rPr>
-              <w:t xml:space="preserve"> ] </w:t>
+              <w:t>5/</w:t>
+            </w:r>
+            <w:proofErr w:type="gramStart"/>
+            <w:r>
+              <w:rPr>
+                <w:color w:val="4F81BD" w:themeColor="accent1"/>
+                <w:sz w:val="16"/>
+                <w:szCs w:val="16"/>
+              </w:rPr>
+              <w:t>2012</w:t>
+            </w:r>
+            <w:r>
+              <w:rPr>
+                <w:color w:val="4F81BD" w:themeColor="accent1"/>
+                <w:sz w:val="16"/>
+                <w:szCs w:val="16"/>
+              </w:rPr>
+              <w:t xml:space="preserve"> ]</w:t>
+            </w:r>
+            <w:proofErr w:type="gramEnd"/>
+            <w:r>
+              <w:rPr>
+                <w:color w:val="4F81BD" w:themeColor="accent1"/>
+                <w:sz w:val="16"/>
+                <w:szCs w:val="16"/>
+              </w:rPr>
+              <w:t xml:space="preserve"> </w:t>
             </w:r>
             <w:r>
               <w:rPr>
@@ -8874,6 +9474,7 @@
             <w:r>
               <w:t xml:space="preserve">Chi Alpha Campus </w:t>
             </w:r>
+            <w:proofErr w:type="gramStart"/>
             <w:r>
               <w:t>Ministries</w:t>
             </w:r>
@@ -8886,7 +9487,16 @@
                 <w:sz w:val="16"/>
                 <w:szCs w:val="16"/>
               </w:rPr>
-              <w:t>[ 201</w:t>
+              <w:t>[</w:t>
+            </w:r>
+            <w:proofErr w:type="gramEnd"/>
+            <w:r>
+              <w:rPr>
+                <w:color w:val="4F81BD" w:themeColor="accent1"/>
+                <w:sz w:val="16"/>
+                <w:szCs w:val="16"/>
+              </w:rPr>
+              <w:t xml:space="preserve"> 201</w:t>
             </w:r>
             <w:r>
               <w:rPr>
@@ -8904,6 +9514,7 @@
               </w:rPr>
               <w:t xml:space="preserve"> – </w:t>
             </w:r>
+            <w:proofErr w:type="gramStart"/>
             <w:r>
               <w:rPr>
                 <w:color w:val="4F81BD" w:themeColor="accent1"/>
@@ -8918,7 +9529,16 @@
                 <w:sz w:val="16"/>
                 <w:szCs w:val="16"/>
               </w:rPr>
-              <w:t xml:space="preserve"> ] </w:t>
+              <w:t xml:space="preserve"> ]</w:t>
+            </w:r>
+            <w:proofErr w:type="gramEnd"/>
+            <w:r>
+              <w:rPr>
+                <w:color w:val="4F81BD" w:themeColor="accent1"/>
+                <w:sz w:val="16"/>
+                <w:szCs w:val="16"/>
+              </w:rPr>
+              <w:t xml:space="preserve"> </w:t>
             </w:r>
             <w:r>
               <w:rPr>
@@ -9003,15 +9623,28 @@
               <w:keepNext w:val="0"/>
             </w:pPr>
             <w:r>
-              <w:t xml:space="preserve">Church Audio-Visual (AV), Information Technology (IT), and Experience Teams  </w:t>
-            </w:r>
-            <w:r>
-              <w:rPr>
-                <w:color w:val="4F81BD" w:themeColor="accent1"/>
-                <w:sz w:val="16"/>
-                <w:szCs w:val="16"/>
-              </w:rPr>
-              <w:t>[ 20</w:t>
+              <w:t xml:space="preserve">Church Audio-Visual (AV), Information Technology (IT), and Experience </w:t>
+            </w:r>
+            <w:proofErr w:type="gramStart"/>
+            <w:r>
+              <w:t xml:space="preserve">Teams  </w:t>
+            </w:r>
+            <w:r>
+              <w:rPr>
+                <w:color w:val="4F81BD" w:themeColor="accent1"/>
+                <w:sz w:val="16"/>
+                <w:szCs w:val="16"/>
+              </w:rPr>
+              <w:t>[</w:t>
+            </w:r>
+            <w:proofErr w:type="gramEnd"/>
+            <w:r>
+              <w:rPr>
+                <w:color w:val="4F81BD" w:themeColor="accent1"/>
+                <w:sz w:val="16"/>
+                <w:szCs w:val="16"/>
+              </w:rPr>
+              <w:t xml:space="preserve"> 20</w:t>
             </w:r>
             <w:r>
               <w:rPr>
@@ -9029,6 +9662,7 @@
               </w:rPr>
               <w:t xml:space="preserve"> – </w:t>
             </w:r>
+            <w:proofErr w:type="gramStart"/>
             <w:r>
               <w:rPr>
                 <w:color w:val="4F81BD" w:themeColor="accent1"/>
@@ -9045,6 +9679,7 @@
               </w:rPr>
               <w:t xml:space="preserve"> ]</w:t>
             </w:r>
+            <w:proofErr w:type="gramEnd"/>
             <w:r>
               <w:rPr>
                 <w:color w:val="4F81BD" w:themeColor="accent1"/>
@@ -9106,16 +9741,39 @@
               <w:keepNext w:val="0"/>
             </w:pPr>
             <w:r>
-              <w:t xml:space="preserve">Virginia Tech Fencing Club  </w:t>
-            </w:r>
-            <w:r>
-              <w:rPr>
-                <w:color w:val="4F81BD" w:themeColor="accent1"/>
-                <w:sz w:val="16"/>
-                <w:szCs w:val="16"/>
-              </w:rPr>
-              <w:t>[ 2013 – 2014 ]</w:t>
-            </w:r>
+              <w:t xml:space="preserve">Virginia Tech Fencing </w:t>
+            </w:r>
+            <w:proofErr w:type="gramStart"/>
+            <w:r>
+              <w:t xml:space="preserve">Club  </w:t>
+            </w:r>
+            <w:r>
+              <w:rPr>
+                <w:color w:val="4F81BD" w:themeColor="accent1"/>
+                <w:sz w:val="16"/>
+                <w:szCs w:val="16"/>
+              </w:rPr>
+              <w:t>[</w:t>
+            </w:r>
+            <w:proofErr w:type="gramEnd"/>
+            <w:r>
+              <w:rPr>
+                <w:color w:val="4F81BD" w:themeColor="accent1"/>
+                <w:sz w:val="16"/>
+                <w:szCs w:val="16"/>
+              </w:rPr>
+              <w:t xml:space="preserve"> 2013 – </w:t>
+            </w:r>
+            <w:proofErr w:type="gramStart"/>
+            <w:r>
+              <w:rPr>
+                <w:color w:val="4F81BD" w:themeColor="accent1"/>
+                <w:sz w:val="16"/>
+                <w:szCs w:val="16"/>
+              </w:rPr>
+              <w:t>2014 ]</w:t>
+            </w:r>
+            <w:proofErr w:type="gramEnd"/>
             <w:r>
               <w:rPr>
                 <w:rFonts w:ascii="Helvetica Neue" w:hAnsi="Helvetica Neue"/>
@@ -9730,7 +10388,7 @@
         <w:sz w:val="16"/>
         <w:szCs w:val="16"/>
       </w:rPr>
-      <w:t>Resume</w:t>
+      <w:t>CV</w:t>
     </w:r>
   </w:p>
 </w:ftr>
@@ -12284,6 +12942,7 @@
     <w:rsid w:val="000666D2"/>
     <w:rsid w:val="00095F4B"/>
     <w:rsid w:val="001078C8"/>
+    <w:rsid w:val="00170EC8"/>
     <w:rsid w:val="001E6351"/>
     <w:rsid w:val="0021240F"/>
     <w:rsid w:val="0021737E"/>

</xml_diff>

<commit_message>
Update logo and contents
</commit_message>
<xml_diff>
--- a/derieux-cv.docx
+++ b/derieux-cv.docx
@@ -11,27 +11,178 @@
       </w:pPr>
       <w:r>
         <w:rPr>
+          <w:rFonts w:hint="eastAsia"/>
+          <w:noProof/>
+          <w:sz w:val="48"/>
+        </w:rPr>
+        <mc:AlternateContent>
+          <mc:Choice Requires="wpg">
+            <w:drawing>
+              <wp:anchor distT="0" distB="0" distL="114300" distR="114300" simplePos="0" relativeHeight="251663360" behindDoc="0" locked="0" layoutInCell="1" allowOverlap="1" wp14:anchorId="16EC93EA" wp14:editId="58769648">
+                <wp:simplePos x="0" y="0"/>
+                <wp:positionH relativeFrom="column">
+                  <wp:posOffset>5447030</wp:posOffset>
+                </wp:positionH>
+                <wp:positionV relativeFrom="paragraph">
+                  <wp:posOffset>267970</wp:posOffset>
+                </wp:positionV>
+                <wp:extent cx="198755" cy="201295"/>
+                <wp:effectExtent l="0" t="0" r="4445" b="1905"/>
+                <wp:wrapNone/>
+                <wp:docPr id="1766758233" name="Group 9">
+                  <a:extLst xmlns:a="http://schemas.openxmlformats.org/drawingml/2006/main">
+                    <a:ext uri="{FF2B5EF4-FFF2-40B4-BE49-F238E27FC236}">
+                      <a16:creationId xmlns:a16="http://schemas.microsoft.com/office/drawing/2014/main" id="{34E33E46-E1D7-BB82-9054-7418858EB9DC}"/>
+                    </a:ext>
+                  </a:extLst>
+                </wp:docPr>
+                <wp:cNvGraphicFramePr/>
+                <a:graphic xmlns:a="http://schemas.openxmlformats.org/drawingml/2006/main">
+                  <a:graphicData uri="http://schemas.microsoft.com/office/word/2010/wordprocessingGroup">
+                    <wpg:wgp>
+                      <wpg:cNvGrpSpPr/>
+                      <wpg:grpSpPr>
+                        <a:xfrm>
+                          <a:off x="0" y="0"/>
+                          <a:ext cx="198755" cy="201295"/>
+                          <a:chOff x="554484" y="558799"/>
+                          <a:chExt cx="448269" cy="453161"/>
+                        </a:xfrm>
+                      </wpg:grpSpPr>
+                      <wps:wsp>
+                        <wps:cNvPr id="408776455" name="Oval 408776455">
+                          <a:hlinkClick r:id="rId8"/>
+                          <a:extLst>
+                            <a:ext uri="{FF2B5EF4-FFF2-40B4-BE49-F238E27FC236}">
+                              <a16:creationId xmlns:a16="http://schemas.microsoft.com/office/drawing/2014/main" id="{07129037-BA94-1163-CC4E-89CB63A549C8}"/>
+                            </a:ext>
+                          </a:extLst>
+                        </wps:cNvPr>
+                        <wps:cNvSpPr/>
+                        <wps:spPr bwMode="auto">
+                          <a:xfrm>
+                            <a:off x="554485" y="563692"/>
+                            <a:ext cx="448268" cy="448268"/>
+                          </a:xfrm>
+                          <a:prstGeom prst="ellipse">
+                            <a:avLst/>
+                          </a:prstGeom>
+                          <a:solidFill>
+                            <a:schemeClr val="bg1"/>
+                          </a:solidFill>
+                          <a:ln w="9525" cap="flat" cmpd="sng" algn="ctr">
+                            <a:noFill/>
+                            <a:prstDash val="solid"/>
+                            <a:round/>
+                            <a:headEnd type="none" w="med" len="med"/>
+                            <a:tailEnd type="none" w="med" len="med"/>
+                          </a:ln>
+                          <a:effectLst/>
+                        </wps:spPr>
+                        <wps:bodyPr vert="horz" wrap="square" lIns="91440" tIns="45720" rIns="91440" bIns="45720" numCol="1" rtlCol="0" anchor="t" anchorCtr="0" compatLnSpc="1">
+                          <a:prstTxWarp prst="textNoShape">
+                            <a:avLst/>
+                          </a:prstTxWarp>
+                        </wps:bodyPr>
+                      </wps:wsp>
+                      <pic:pic xmlns:pic="http://schemas.openxmlformats.org/drawingml/2006/picture">
+                        <pic:nvPicPr>
+                          <pic:cNvPr id="580215447" name="Graphic 11">
+                            <a:hlinkClick r:id="rId8"/>
+                            <a:extLst>
+                              <a:ext uri="{FF2B5EF4-FFF2-40B4-BE49-F238E27FC236}">
+                                <a16:creationId xmlns:a16="http://schemas.microsoft.com/office/drawing/2014/main" id="{550183DF-4147-F79C-C0FB-0AEC76A456F2}"/>
+                              </a:ext>
+                            </a:extLst>
+                          </pic:cNvPr>
+                          <pic:cNvPicPr>
+                            <a:picLocks noChangeAspect="1"/>
+                          </pic:cNvPicPr>
+                        </pic:nvPicPr>
+                        <pic:blipFill>
+                          <a:blip r:embed="rId9">
+                            <a:extLst>
+                              <a:ext uri="{96DAC541-7B7A-43D3-8B79-37D633B846F1}">
+                                <asvg:svgBlip xmlns:asvg="http://schemas.microsoft.com/office/drawing/2016/SVG/main" r:embed="rId10"/>
+                              </a:ext>
+                            </a:extLst>
+                          </a:blip>
+                          <a:srcRect/>
+                          <a:stretch/>
+                        </pic:blipFill>
+                        <pic:spPr>
+                          <a:xfrm>
+                            <a:off x="554484" y="558799"/>
+                            <a:ext cx="448269" cy="442128"/>
+                          </a:xfrm>
+                          <a:prstGeom prst="rect">
+                            <a:avLst/>
+                          </a:prstGeom>
+                        </pic:spPr>
+                      </pic:pic>
+                    </wpg:wgp>
+                  </a:graphicData>
+                </a:graphic>
+              </wp:anchor>
+            </w:drawing>
+          </mc:Choice>
+          <mc:Fallback>
+            <w:pict>
+              <v:group w14:anchorId="50DFC84B" id="Group 9" o:spid="_x0000_s1026" style="position:absolute;margin-left:428.9pt;margin-top:21.1pt;width:15.65pt;height:15.85pt;z-index:251663360" coordorigin="5544,5587" coordsize="4482,4531" o:gfxdata="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">
+                <v:oval id="Oval 408776455" o:spid="_x0000_s1027" href="https://github.com/news-vt/eqmarl" style="position:absolute;left:5544;top:5636;width:4483;height:4483;visibility:visible;mso-wrap-style:square;v-text-anchor:top" o:gfxdata="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" o:button="t" fillcolor="white [3212]" stroked="f">
+                  <v:fill o:detectmouseclick="t"/>
+                </v:oval>
+                <v:shapetype id="_x0000_t75" coordsize="21600,21600" o:spt="75" o:preferrelative="t" path="m@4@5l@4@11@9@11@9@5xe" filled="f" stroked="f">
+                  <v:stroke joinstyle="miter"/>
+                  <v:formulas>
+                    <v:f eqn="if lineDrawn pixelLineWidth 0"/>
+                    <v:f eqn="sum @0 1 0"/>
+                    <v:f eqn="sum 0 0 @1"/>
+                    <v:f eqn="prod @2 1 2"/>
+                    <v:f eqn="prod @3 21600 pixelWidth"/>
+                    <v:f eqn="prod @3 21600 pixelHeight"/>
+                    <v:f eqn="sum @0 0 1"/>
+                    <v:f eqn="prod @6 1 2"/>
+                    <v:f eqn="prod @7 21600 pixelWidth"/>
+                    <v:f eqn="sum @8 21600 0"/>
+                    <v:f eqn="prod @7 21600 pixelHeight"/>
+                    <v:f eqn="sum @10 21600 0"/>
+                  </v:formulas>
+                  <v:path o:extrusionok="f" gradientshapeok="t" o:connecttype="rect"/>
+                  <o:lock v:ext="edit" aspectratio="t"/>
+                </v:shapetype>
+                <v:shape id="Graphic 11" o:spid="_x0000_s1028" type="#_x0000_t75" href="https://github.com/news-vt/eqmarl" style="position:absolute;left:5544;top:5587;width:4483;height:4422;visibility:visible;mso-wrap-style:square" o:gfxdata="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" o:button="t">
+                  <v:fill o:detectmouseclick="t"/>
+                  <v:imagedata r:id="rId11" o:title=""/>
+                </v:shape>
+              </v:group>
+            </w:pict>
+          </mc:Fallback>
+        </mc:AlternateContent>
+      </w:r>
+      <w:r>
+        <w:rPr>
           <w:noProof/>
           <w:sz w:val="2"/>
           <w:szCs w:val="2"/>
         </w:rPr>
         <w:drawing>
-          <wp:anchor distT="0" distB="0" distL="114300" distR="114300" simplePos="0" relativeHeight="251656192" behindDoc="0" locked="0" layoutInCell="1" allowOverlap="1" wp14:anchorId="5A7EC8B1" wp14:editId="2E1F5A4F">
+          <wp:anchor distT="0" distB="0" distL="114300" distR="114300" simplePos="0" relativeHeight="251662336" behindDoc="0" locked="0" layoutInCell="1" allowOverlap="1" wp14:anchorId="0ED92676" wp14:editId="6968118F">
             <wp:simplePos x="0" y="0"/>
             <wp:positionH relativeFrom="column">
-              <wp:posOffset>6121400</wp:posOffset>
+              <wp:posOffset>5147310</wp:posOffset>
             </wp:positionH>
             <wp:positionV relativeFrom="paragraph">
-              <wp:posOffset>-8467</wp:posOffset>
+              <wp:posOffset>-15875</wp:posOffset>
             </wp:positionV>
-            <wp:extent cx="763058" cy="763058"/>
+            <wp:extent cx="763270" cy="763270"/>
             <wp:effectExtent l="0" t="0" r="0" b="0"/>
             <wp:wrapNone/>
-            <wp:docPr id="1921455873" name="Picture 7">
-              <a:hlinkClick xmlns:a="http://schemas.openxmlformats.org/drawingml/2006/main" r:id="rId8"/>
+            <wp:docPr id="744899699" name="Picture 7">
+              <a:hlinkClick xmlns:a="http://schemas.openxmlformats.org/drawingml/2006/main" r:id="rId12"/>
               <a:extLst xmlns:a="http://schemas.openxmlformats.org/drawingml/2006/main">
                 <a:ext uri="{FF2B5EF4-FFF2-40B4-BE49-F238E27FC236}">
-                  <a16:creationId xmlns:a16="http://schemas.microsoft.com/office/drawing/2014/main" id="{56B23A86-56E0-68C0-97BA-FF1E7EF0F85B}"/>
+                  <a16:creationId xmlns:a16="http://schemas.microsoft.com/office/drawing/2014/main" id="{990593A1-F077-06CF-5AE3-E6DD28C4C006}"/>
                 </a:ext>
               </a:extLst>
             </wp:docPr>
@@ -42,11 +193,11 @@
               <a:graphicData uri="http://schemas.openxmlformats.org/drawingml/2006/picture">
                 <pic:pic xmlns:pic="http://schemas.openxmlformats.org/drawingml/2006/picture">
                   <pic:nvPicPr>
-                    <pic:cNvPr id="1921455873" name="Picture 7">
-                      <a:hlinkClick r:id="rId8"/>
+                    <pic:cNvPr id="744899699" name="Picture 7">
+                      <a:hlinkClick r:id="rId12"/>
                       <a:extLst>
                         <a:ext uri="{FF2B5EF4-FFF2-40B4-BE49-F238E27FC236}">
-                          <a16:creationId xmlns:a16="http://schemas.microsoft.com/office/drawing/2014/main" id="{56B23A86-56E0-68C0-97BA-FF1E7EF0F85B}"/>
+                          <a16:creationId xmlns:a16="http://schemas.microsoft.com/office/drawing/2014/main" id="{990593A1-F077-06CF-5AE3-E6DD28C4C006}"/>
                         </a:ext>
                       </a:extLst>
                     </pic:cNvPr>
@@ -55,15 +206,14 @@
                     </pic:cNvPicPr>
                   </pic:nvPicPr>
                   <pic:blipFill>
-                    <a:blip r:embed="rId9"/>
-                    <a:stretch>
-                      <a:fillRect/>
-                    </a:stretch>
+                    <a:blip r:embed="rId13"/>
+                    <a:srcRect/>
+                    <a:stretch/>
                   </pic:blipFill>
                   <pic:spPr>
                     <a:xfrm>
                       <a:off x="0" y="0"/>
-                      <a:ext cx="763058" cy="763058"/>
+                      <a:ext cx="763270" cy="763270"/>
                     </a:xfrm>
                     <a:prstGeom prst="rect">
                       <a:avLst/>
@@ -82,22 +232,22 @@
           <w:szCs w:val="2"/>
         </w:rPr>
         <w:drawing>
-          <wp:anchor distT="0" distB="0" distL="114300" distR="114300" simplePos="0" relativeHeight="251662336" behindDoc="0" locked="0" layoutInCell="1" allowOverlap="1" wp14:anchorId="0ED92676" wp14:editId="5B311372">
+          <wp:anchor distT="0" distB="0" distL="114300" distR="114300" simplePos="0" relativeHeight="251656192" behindDoc="0" locked="0" layoutInCell="1" allowOverlap="1" wp14:anchorId="5A7EC8B1" wp14:editId="1BEBB2C2">
             <wp:simplePos x="0" y="0"/>
             <wp:positionH relativeFrom="column">
-              <wp:posOffset>5147733</wp:posOffset>
+              <wp:posOffset>6121400</wp:posOffset>
             </wp:positionH>
             <wp:positionV relativeFrom="paragraph">
-              <wp:posOffset>-8467</wp:posOffset>
+              <wp:posOffset>-15875</wp:posOffset>
             </wp:positionV>
-            <wp:extent cx="763694" cy="763694"/>
+            <wp:extent cx="762635" cy="762635"/>
             <wp:effectExtent l="0" t="0" r="0" b="0"/>
             <wp:wrapNone/>
-            <wp:docPr id="744899699" name="Picture 7">
-              <a:hlinkClick xmlns:a="http://schemas.openxmlformats.org/drawingml/2006/main" r:id="rId10"/>
+            <wp:docPr id="1921455873" name="Picture 7">
+              <a:hlinkClick xmlns:a="http://schemas.openxmlformats.org/drawingml/2006/main" r:id="rId14"/>
               <a:extLst xmlns:a="http://schemas.openxmlformats.org/drawingml/2006/main">
                 <a:ext uri="{FF2B5EF4-FFF2-40B4-BE49-F238E27FC236}">
-                  <a16:creationId xmlns:a16="http://schemas.microsoft.com/office/drawing/2014/main" id="{990593A1-F077-06CF-5AE3-E6DD28C4C006}"/>
+                  <a16:creationId xmlns:a16="http://schemas.microsoft.com/office/drawing/2014/main" id="{56B23A86-56E0-68C0-97BA-FF1E7EF0F85B}"/>
                 </a:ext>
               </a:extLst>
             </wp:docPr>
@@ -108,11 +258,11 @@
               <a:graphicData uri="http://schemas.openxmlformats.org/drawingml/2006/picture">
                 <pic:pic xmlns:pic="http://schemas.openxmlformats.org/drawingml/2006/picture">
                   <pic:nvPicPr>
-                    <pic:cNvPr id="744899699" name="Picture 7">
-                      <a:hlinkClick r:id="rId10"/>
+                    <pic:cNvPr id="1921455873" name="Picture 7">
+                      <a:hlinkClick r:id="rId14"/>
                       <a:extLst>
                         <a:ext uri="{FF2B5EF4-FFF2-40B4-BE49-F238E27FC236}">
-                          <a16:creationId xmlns:a16="http://schemas.microsoft.com/office/drawing/2014/main" id="{990593A1-F077-06CF-5AE3-E6DD28C4C006}"/>
+                          <a16:creationId xmlns:a16="http://schemas.microsoft.com/office/drawing/2014/main" id="{56B23A86-56E0-68C0-97BA-FF1E7EF0F85B}"/>
                         </a:ext>
                       </a:extLst>
                     </pic:cNvPr>
@@ -121,14 +271,15 @@
                     </pic:cNvPicPr>
                   </pic:nvPicPr>
                   <pic:blipFill>
-                    <a:blip r:embed="rId11"/>
-                    <a:srcRect/>
-                    <a:stretch/>
+                    <a:blip r:embed="rId15"/>
+                    <a:stretch>
+                      <a:fillRect/>
+                    </a:stretch>
                   </pic:blipFill>
                   <pic:spPr>
                     <a:xfrm>
                       <a:off x="0" y="0"/>
-                      <a:ext cx="763694" cy="763694"/>
+                      <a:ext cx="762635" cy="762635"/>
                     </a:xfrm>
                     <a:prstGeom prst="rect">
                       <a:avLst/>
@@ -204,13 +355,13 @@
               <mc:AlternateContent>
                 <mc:Choice Requires="wpg">
                   <w:drawing>
-                    <wp:anchor distT="0" distB="0" distL="114300" distR="114300" simplePos="0" relativeHeight="251657216" behindDoc="0" locked="0" layoutInCell="1" allowOverlap="1" wp14:anchorId="4C8668DA" wp14:editId="03D850DC">
+                    <wp:anchor distT="0" distB="0" distL="114300" distR="114300" simplePos="0" relativeHeight="251667456" behindDoc="0" locked="0" layoutInCell="1" allowOverlap="1" wp14:anchorId="0DED8CC3" wp14:editId="6D3DCD55">
                       <wp:simplePos x="0" y="0"/>
                       <wp:positionH relativeFrom="column">
-                        <wp:posOffset>5773367</wp:posOffset>
+                        <wp:posOffset>5772785</wp:posOffset>
                       </wp:positionH>
                       <wp:positionV relativeFrom="paragraph">
-                        <wp:posOffset>269832</wp:posOffset>
+                        <wp:posOffset>255975</wp:posOffset>
                       </wp:positionV>
                       <wp:extent cx="199525" cy="194160"/>
                       <wp:effectExtent l="0" t="0" r="3810" b="0"/>
@@ -282,7 +433,7 @@
                             <pic:pic xmlns:pic="http://schemas.openxmlformats.org/drawingml/2006/picture">
                               <pic:nvPicPr>
                                 <pic:cNvPr id="758647372" name="Picture 758647372" descr="A blue and black logo&#10;&#10;AI-generated content may be incorrect.">
-                                  <a:hlinkClick r:id="rId8"/>
+                                  <a:hlinkClick r:id="rId14"/>
                                   <a:extLst>
                                     <a:ext uri="{FF2B5EF4-FFF2-40B4-BE49-F238E27FC236}">
                                       <a16:creationId xmlns:a16="http://schemas.microsoft.com/office/drawing/2014/main" id="{BAD4061B-FC26-49D6-F9FC-EE8660A0BCA6}"/>
@@ -294,7 +445,7 @@
                                 </pic:cNvPicPr>
                               </pic:nvPicPr>
                               <pic:blipFill>
-                                <a:blip r:embed="rId12">
+                                <a:blip r:embed="rId16">
                                   <a:extLst>
                                     <a:ext uri="{28A0092B-C50C-407E-A947-70E740481C1C}">
                                       <a14:useLocalDpi xmlns:a14="http://schemas.microsoft.com/office/drawing/2010/main" val="0"/>
@@ -322,7 +473,7 @@
                 </mc:Choice>
                 <mc:Fallback>
                   <w:pict>
-                    <v:group w14:anchorId="1AFBC57D" id="Group 30" o:spid="_x0000_s1026" style="position:absolute;margin-left:454.6pt;margin-top:21.25pt;width:15.7pt;height:15.3pt;z-index:251657216" coordorigin="5540,5726" coordsize="3796,3694" o:gfxdata="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">
+                    <v:group w14:anchorId="587524A1" id="Group 30" o:spid="_x0000_s1026" style="position:absolute;margin-left:454.55pt;margin-top:20.15pt;width:15.7pt;height:15.3pt;z-index:251667456" coordorigin="5540,5726" coordsize="3796,3694" o:gfxdata="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">
                       <v:roundrect id="Rounded Rectangle 765305771" o:spid="_x0000_s1027" style="position:absolute;left:5628;top:5796;width:3493;height:3493;visibility:visible;mso-wrap-style:square;v-text-anchor:middle" arcsize="5115f" o:gfxdata="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" fillcolor="white [3212]" stroked="f" strokeweight="2pt"/>
                       <v:shapetype id="_x0000_t75" coordsize="21600,21600" o:spt="75" o:preferrelative="t" path="m@4@5l@4@11@9@11@9@5xe" filled="f" stroked="f">
                         <v:stroke joinstyle="miter"/>
@@ -345,139 +496,7 @@
                       </v:shapetype>
                       <v:shape id="Picture 758647372" o:spid="_x0000_s1028" type="#_x0000_t75" alt="A blue and black logo&#10;&#10;AI-generated content may be incorrect." href="http://www.linkedin.com/in/alexderieux" style="position:absolute;left:5540;top:5726;width:3796;height:3695;visibility:visible;mso-wrap-style:square" o:gfxdata="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" o:button="t">
                         <v:fill o:detectmouseclick="t"/>
-                        <v:imagedata r:id="rId13" o:title="A blue and black logo&#10;&#10;AI-generated content may be incorrect" cropleft="1f" cropright="8379f"/>
-                      </v:shape>
-                    </v:group>
-                  </w:pict>
-                </mc:Fallback>
-              </mc:AlternateContent>
-            </w:r>
-            <w:r>
-              <w:rPr>
-                <w:rFonts w:hint="eastAsia"/>
-                <w:noProof/>
-                <w:sz w:val="48"/>
-              </w:rPr>
-              <mc:AlternateContent>
-                <mc:Choice Requires="wpg">
-                  <w:drawing>
-                    <wp:anchor distT="0" distB="0" distL="114300" distR="114300" simplePos="0" relativeHeight="251663360" behindDoc="0" locked="0" layoutInCell="1" allowOverlap="1" wp14:anchorId="16EC93EA" wp14:editId="0BA67B8C">
-                      <wp:simplePos x="0" y="0"/>
-                      <wp:positionH relativeFrom="column">
-                        <wp:posOffset>4804244</wp:posOffset>
-                      </wp:positionH>
-                      <wp:positionV relativeFrom="paragraph">
-                        <wp:posOffset>261454</wp:posOffset>
-                      </wp:positionV>
-                      <wp:extent cx="199196" cy="201370"/>
-                      <wp:effectExtent l="0" t="0" r="4445" b="1905"/>
-                      <wp:wrapNone/>
-                      <wp:docPr id="1766758233" name="Group 9">
-                        <a:extLst xmlns:a="http://schemas.openxmlformats.org/drawingml/2006/main">
-                          <a:ext uri="{FF2B5EF4-FFF2-40B4-BE49-F238E27FC236}">
-                            <a16:creationId xmlns:a16="http://schemas.microsoft.com/office/drawing/2014/main" id="{34E33E46-E1D7-BB82-9054-7418858EB9DC}"/>
-                          </a:ext>
-                        </a:extLst>
-                      </wp:docPr>
-                      <wp:cNvGraphicFramePr/>
-                      <a:graphic xmlns:a="http://schemas.openxmlformats.org/drawingml/2006/main">
-                        <a:graphicData uri="http://schemas.microsoft.com/office/word/2010/wordprocessingGroup">
-                          <wpg:wgp>
-                            <wpg:cNvGrpSpPr/>
-                            <wpg:grpSpPr>
-                              <a:xfrm>
-                                <a:off x="0" y="0"/>
-                                <a:ext cx="199196" cy="201370"/>
-                                <a:chOff x="554484" y="558799"/>
-                                <a:chExt cx="448269" cy="453161"/>
-                              </a:xfrm>
-                            </wpg:grpSpPr>
-                            <wps:wsp>
-                              <wps:cNvPr id="408776455" name="Oval 408776455">
-                                <a:hlinkClick r:id="rId14"/>
-                                <a:extLst>
-                                  <a:ext uri="{FF2B5EF4-FFF2-40B4-BE49-F238E27FC236}">
-                                    <a16:creationId xmlns:a16="http://schemas.microsoft.com/office/drawing/2014/main" id="{07129037-BA94-1163-CC4E-89CB63A549C8}"/>
-                                  </a:ext>
-                                </a:extLst>
-                              </wps:cNvPr>
-                              <wps:cNvSpPr/>
-                              <wps:spPr bwMode="auto">
-                                <a:xfrm>
-                                  <a:off x="554485" y="563692"/>
-                                  <a:ext cx="448268" cy="448268"/>
-                                </a:xfrm>
-                                <a:prstGeom prst="ellipse">
-                                  <a:avLst/>
-                                </a:prstGeom>
-                                <a:solidFill>
-                                  <a:schemeClr val="bg1"/>
-                                </a:solidFill>
-                                <a:ln w="9525" cap="flat" cmpd="sng" algn="ctr">
-                                  <a:noFill/>
-                                  <a:prstDash val="solid"/>
-                                  <a:round/>
-                                  <a:headEnd type="none" w="med" len="med"/>
-                                  <a:tailEnd type="none" w="med" len="med"/>
-                                </a:ln>
-                                <a:effectLst/>
-                              </wps:spPr>
-                              <wps:bodyPr vert="horz" wrap="square" lIns="91440" tIns="45720" rIns="91440" bIns="45720" numCol="1" rtlCol="0" anchor="t" anchorCtr="0" compatLnSpc="1">
-                                <a:prstTxWarp prst="textNoShape">
-                                  <a:avLst/>
-                                </a:prstTxWarp>
-                              </wps:bodyPr>
-                            </wps:wsp>
-                            <pic:pic xmlns:pic="http://schemas.openxmlformats.org/drawingml/2006/picture">
-                              <pic:nvPicPr>
-                                <pic:cNvPr id="580215447" name="Graphic 11">
-                                  <a:hlinkClick r:id="rId14"/>
-                                  <a:extLst>
-                                    <a:ext uri="{FF2B5EF4-FFF2-40B4-BE49-F238E27FC236}">
-                                      <a16:creationId xmlns:a16="http://schemas.microsoft.com/office/drawing/2014/main" id="{550183DF-4147-F79C-C0FB-0AEC76A456F2}"/>
-                                    </a:ext>
-                                  </a:extLst>
-                                </pic:cNvPr>
-                                <pic:cNvPicPr>
-                                  <a:picLocks noChangeAspect="1"/>
-                                </pic:cNvPicPr>
-                              </pic:nvPicPr>
-                              <pic:blipFill>
-                                <a:blip r:embed="rId15">
-                                  <a:extLst>
-                                    <a:ext uri="{96DAC541-7B7A-43D3-8B79-37D633B846F1}">
-                                      <asvg:svgBlip xmlns:asvg="http://schemas.microsoft.com/office/drawing/2016/SVG/main" r:embed="rId16"/>
-                                    </a:ext>
-                                  </a:extLst>
-                                </a:blip>
-                                <a:srcRect/>
-                                <a:stretch/>
-                              </pic:blipFill>
-                              <pic:spPr>
-                                <a:xfrm>
-                                  <a:off x="554484" y="558799"/>
-                                  <a:ext cx="448269" cy="442128"/>
-                                </a:xfrm>
-                                <a:prstGeom prst="rect">
-                                  <a:avLst/>
-                                </a:prstGeom>
-                              </pic:spPr>
-                            </pic:pic>
-                          </wpg:wgp>
-                        </a:graphicData>
-                      </a:graphic>
-                    </wp:anchor>
-                  </w:drawing>
-                </mc:Choice>
-                <mc:Fallback>
-                  <w:pict>
-                    <v:group w14:anchorId="768D95E8" id="Group 9" o:spid="_x0000_s1026" style="position:absolute;margin-left:378.3pt;margin-top:20.6pt;width:15.7pt;height:15.85pt;z-index:251663360" coordorigin="5544,5587" coordsize="4482,4531" o:gfxdata="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">
-                      <v:oval id="Oval 408776455" o:spid="_x0000_s1027" href="https://github.com/news-vt/eqmarl" style="position:absolute;left:5544;top:5636;width:4483;height:4483;visibility:visible;mso-wrap-style:square;v-text-anchor:top" o:gfxdata="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" o:button="t" fillcolor="white [3212]" stroked="f">
-                        <v:fill o:detectmouseclick="t"/>
-                      </v:oval>
-                      <v:shape id="Graphic 11" o:spid="_x0000_s1028" type="#_x0000_t75" href="https://github.com/news-vt/eqmarl" style="position:absolute;left:5544;top:5587;width:4483;height:4422;visibility:visible;mso-wrap-style:square" o:gfxdata="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" o:button="t">
-                        <v:fill o:detectmouseclick="t"/>
-                        <v:imagedata r:id="rId17" o:title=""/>
+                        <v:imagedata r:id="rId17" o:title="A blue and black logo&#10;&#10;AI-generated content may be incorrect" cropleft="1f" cropright="8379f"/>
                       </v:shape>
                     </v:group>
                   </w:pict>
@@ -539,33 +558,34 @@
               <w:tblLook w:val="04A0" w:firstRow="1" w:lastRow="0" w:firstColumn="1" w:lastColumn="0" w:noHBand="0" w:noVBand="1"/>
             </w:tblPr>
             <w:tblGrid>
-              <w:gridCol w:w="290"/>
-              <w:gridCol w:w="2327"/>
-              <w:gridCol w:w="270"/>
-              <w:gridCol w:w="1525"/>
-              <w:gridCol w:w="270"/>
-              <w:gridCol w:w="3060"/>
-              <w:gridCol w:w="367"/>
-              <w:gridCol w:w="1691"/>
+              <w:gridCol w:w="161"/>
+              <w:gridCol w:w="2370"/>
+              <w:gridCol w:w="284"/>
+              <w:gridCol w:w="1558"/>
+              <w:gridCol w:w="284"/>
+              <w:gridCol w:w="3081"/>
+              <w:gridCol w:w="372"/>
+              <w:gridCol w:w="1690"/>
             </w:tblGrid>
             <w:tr>
               <w:tc>
                 <w:tcPr>
-                  <w:tcW w:w="148" w:type="pct"/>
+                  <w:tcW w:w="82" w:type="pct"/>
                 </w:tcPr>
                 <w:p>
                   <w:pPr>
                     <w:pStyle w:val="ContactDetails"/>
                     <w:rPr>
                       <w:color w:val="404040" w:themeColor="text1" w:themeTint="BF"/>
-                      <w:sz w:val="24"/>
+                      <w:sz w:val="10"/>
+                      <w:szCs w:val="10"/>
                     </w:rPr>
                   </w:pPr>
                 </w:p>
               </w:tc>
               <w:tc>
                 <w:tcPr>
-                  <w:tcW w:w="3989" w:type="pct"/>
+                  <w:tcW w:w="4056" w:type="pct"/>
                   <w:gridSpan w:val="6"/>
                 </w:tcPr>
                 <w:p>
@@ -577,20 +597,66 @@
                       <w:color w:val="1F497D" w:themeColor="text2"/>
                       <w:sz w:val="24"/>
                     </w:rPr>
-                    <w:t xml:space="preserve">Scientist + </w:t>
-                  </w:r>
+                    <w:t xml:space="preserve">Quantum AI </w:t>
+                  </w:r>
+                  <w:proofErr w:type="gramStart"/>
                   <w:r>
                     <w:rPr>
                       <w:color w:val="1F497D" w:themeColor="text2"/>
                       <w:sz w:val="24"/>
                     </w:rPr>
-                    <w:t>Engineer + Developer</w:t>
-                  </w:r>
+                    <w:t>{ Scientist</w:t>
+                  </w:r>
+                  <w:proofErr w:type="gramEnd"/>
+                  <w:r>
+                    <w:rPr>
+                      <w:color w:val="1F497D" w:themeColor="text2"/>
+                      <w:sz w:val="24"/>
+                    </w:rPr>
+                    <w:t xml:space="preserve">, </w:t>
+                  </w:r>
+                  <w:r>
+                    <w:rPr>
+                      <w:color w:val="1F497D" w:themeColor="text2"/>
+                      <w:sz w:val="24"/>
+                    </w:rPr>
+                    <w:t>Engineer</w:t>
+                  </w:r>
+                  <w:r>
+                    <w:rPr>
+                      <w:color w:val="1F497D" w:themeColor="text2"/>
+                      <w:sz w:val="24"/>
+                    </w:rPr>
+                    <w:t>,</w:t>
+                  </w:r>
+                  <w:r>
+                    <w:rPr>
+                      <w:color w:val="1F497D" w:themeColor="text2"/>
+                      <w:sz w:val="24"/>
+                    </w:rPr>
+                    <w:t xml:space="preserve"> </w:t>
+                  </w:r>
+                  <w:proofErr w:type="gramStart"/>
+                  <w:r>
+                    <w:rPr>
+                      <w:color w:val="1F497D" w:themeColor="text2"/>
+                      <w:sz w:val="24"/>
+                    </w:rPr>
+                    <w:t>Developer</w:t>
+                  </w:r>
+                  <w:r>
+                    <w:rPr>
+                      <w:color w:val="1F497D" w:themeColor="text2"/>
+                      <w:sz w:val="24"/>
+                    </w:rPr>
+                    <w:t xml:space="preserve"> }</w:t>
+                  </w:r>
+                  <w:proofErr w:type="gramEnd"/>
                 </w:p>
               </w:tc>
               <w:tc>
                 <w:tcPr>
-                  <w:tcW w:w="863" w:type="pct"/>
+                  <w:tcW w:w="862" w:type="pct"/>
                 </w:tcPr>
                 <w:p>
                   <w:pPr>
@@ -602,21 +668,25 @@
             <w:tr>
               <w:trPr>
                 <w:gridAfter w:val="2"/>
-                <w:wAfter w:w="1050" w:type="pct"/>
+                <w:wAfter w:w="1052" w:type="pct"/>
               </w:trPr>
               <w:tc>
                 <w:tcPr>
-                  <w:tcW w:w="148" w:type="pct"/>
+                  <w:tcW w:w="82" w:type="pct"/>
                 </w:tcPr>
                 <w:p>
                   <w:pPr>
                     <w:pStyle w:val="ContactDetails"/>
+                    <w:rPr>
+                      <w:sz w:val="10"/>
+                      <w:szCs w:val="10"/>
+                    </w:rPr>
                   </w:pPr>
                 </w:p>
               </w:tc>
               <w:tc>
                 <w:tcPr>
-                  <w:tcW w:w="1187" w:type="pct"/>
+                  <w:tcW w:w="1209" w:type="pct"/>
                 </w:tcPr>
                 <w:p>
                   <w:pPr>
@@ -630,7 +700,7 @@
               </w:tc>
               <w:tc>
                 <w:tcPr>
-                  <w:tcW w:w="138" w:type="pct"/>
+                  <w:tcW w:w="145" w:type="pct"/>
                 </w:tcPr>
                 <w:p>
                   <w:pPr>
@@ -645,17 +715,14 @@
               </w:tc>
               <w:tc>
                 <w:tcPr>
-                  <w:tcW w:w="778" w:type="pct"/>
+                  <w:tcW w:w="795" w:type="pct"/>
                 </w:tcPr>
                 <w:p>
                   <w:pPr>
                     <w:pStyle w:val="ContactDetails"/>
                   </w:pPr>
                   <w:r>
-                    <w:t>GitHub</w:t>
-                  </w:r>
-                  <w:r>
-                    <w:t xml:space="preserve">: </w:t>
+                    <w:t xml:space="preserve">GitHub: </w:t>
                   </w:r>
                   <w:hyperlink r:id="rId18" w:history="1">
                     <w:proofErr w:type="spellStart"/>
@@ -675,7 +742,7 @@
               </w:tc>
               <w:tc>
                 <w:tcPr>
-                  <w:tcW w:w="138" w:type="pct"/>
+                  <w:tcW w:w="145" w:type="pct"/>
                 </w:tcPr>
                 <w:p>
                   <w:pPr>
@@ -689,7 +756,7 @@
               </w:tc>
               <w:tc>
                 <w:tcPr>
-                  <w:tcW w:w="1561" w:type="pct"/>
+                  <w:tcW w:w="1572" w:type="pct"/>
                 </w:tcPr>
                 <w:p>
                   <w:pPr>
@@ -2020,7 +2087,13 @@
                     <w:t>m</w:t>
                   </w:r>
                   <w:r>
-                    <w:t xml:space="preserve">achine Learning research with applications to areas of smart cities, wireless communications, optimization, </w:t>
+                    <w:t xml:space="preserve">achine </w:t>
+                  </w:r>
+                  <w:r>
+                    <w:t>l</w:t>
+                  </w:r>
+                  <w:r>
+                    <w:t xml:space="preserve">earning research with applications to areas of smart cities, wireless communications, optimization, </w:t>
                   </w:r>
                   <w:r>
                     <w:t xml:space="preserve">and </w:t>
@@ -5589,13 +5662,13 @@
               <w:tblLook w:val="04A0" w:firstRow="1" w:lastRow="0" w:firstColumn="1" w:lastColumn="0" w:noHBand="0" w:noVBand="1"/>
             </w:tblPr>
             <w:tblGrid>
-              <w:gridCol w:w="8092"/>
-              <w:gridCol w:w="1528"/>
+              <w:gridCol w:w="9027"/>
+              <w:gridCol w:w="593"/>
             </w:tblGrid>
             <w:tr>
               <w:tc>
                 <w:tcPr>
-                  <w:tcW w:w="4206" w:type="pct"/>
+                  <w:tcW w:w="4692" w:type="pct"/>
                 </w:tcPr>
                 <w:p>
                   <w:pPr>
@@ -5614,7 +5687,7 @@
               </w:tc>
               <w:tc>
                 <w:tcPr>
-                  <w:tcW w:w="794" w:type="pct"/>
+                  <w:tcW w:w="308" w:type="pct"/>
                 </w:tcPr>
                 <w:p>
                   <w:pPr>
@@ -5622,13 +5695,8 @@
                     <w:keepNext w:val="0"/>
                   </w:pPr>
                   <w:r>
-                    <w:t>[ 4/</w:t>
-                  </w:r>
-                  <w:proofErr w:type="gramStart"/>
-                  <w:r>
-                    <w:t>2025 ]</w:t>
-                  </w:r>
-                  <w:proofErr w:type="gramEnd"/>
+                    <w:t>[4/2025]</w:t>
+                  </w:r>
                 </w:p>
               </w:tc>
             </w:tr>
@@ -5941,13 +6009,19 @@
                     <w:pStyle w:val="Content"/>
                   </w:pPr>
                   <w:r>
-                    <w:t xml:space="preserve">Joint effort with Virginia Tech and University of Colorado Boulder. Designed </w:t>
+                    <w:t xml:space="preserve">Joint effort with </w:t>
+                  </w:r>
+                  <w:r>
+                    <w:t>VT</w:t>
+                  </w:r>
+                  <w:r>
+                    <w:t xml:space="preserve"> and University of Colorado Boulder. Designed </w:t>
                   </w:r>
                   <w:r>
                     <w:t>machine learning frameworks with data fusion to grow "smart" garden alleys in Makassar City, Indonesia</w:t>
                   </w:r>
                   <w:r>
-                    <w:t xml:space="preserve"> in effort to </w:t>
+                    <w:t xml:space="preserve"> in to </w:t>
                   </w:r>
                   <w:r>
                     <w:t xml:space="preserve">bolster </w:t>
@@ -12970,6 +13044,7 @@
     <w:rsid w:val="00920774"/>
     <w:rsid w:val="00963654"/>
     <w:rsid w:val="009B4380"/>
+    <w:rsid w:val="00A74C64"/>
     <w:rsid w:val="00B16D3B"/>
     <w:rsid w:val="00B3182F"/>
     <w:rsid w:val="00B67F5F"/>
@@ -12987,6 +13062,7 @@
     <w:rsid w:val="00EC60A9"/>
     <w:rsid w:val="00EE20C5"/>
     <w:rsid w:val="00EE3FE8"/>
+    <w:rsid w:val="00FB2471"/>
     <w:rsid w:val="00FC2B46"/>
     <w:rsid w:val="00FC7234"/>
     <w:rsid w:val="00FE52AF"/>

</xml_diff>